<commit_message>
fix: renumber FMS.5 v2 so nested What-we-do steps do not collide
Promote stop-work to section 6 (standing duty, not a fire-response step).
Procedure subsections are 5.1–5.8; remaining sections run 7–13.
Shared disclaimer P1 is unchanged. Regenerates FMS.5_v2_preview.docx.

Co-authored-by: upadhyaymehul9-prog <upadhyaymehul9-prog@users.noreply.github.com>
</commit_message>
<xml_diff>
--- a/policies/build/preview/FMS.5_v2_preview.docx
+++ b/policies/build/preview/FMS.5_v2_preview.docx
@@ -175,7 +175,7 @@
                 <w:sz w:val="18"/>
                 <w:szCs w:val="18"/>
               </w:rPr>
-              <w:t xml:space="preserve">2.0</w:t>
+              <w:t xml:space="preserve">2.1</w:t>
             </w:r>
           </w:p>
         </w:tc>
@@ -1429,7 +1429,7 @@
         <w:spacing w:after="100" w:before="220"/>
       </w:pPr>
       <w:r>
-        <w:t xml:space="preserve">1. Detection and raising the alarm</w:t>
+        <w:t xml:space="preserve">5.1 Detection and raising the alarm</w:t>
       </w:r>
     </w:p>
     <w:p>
@@ -1498,7 +1498,7 @@
         <w:spacing w:after="100" w:before="220"/>
       </w:pPr>
       <w:r>
-        <w:t xml:space="preserve">2. First attack and containment</w:t>
+        <w:t xml:space="preserve">5.2 First attack and containment</w:t>
       </w:r>
     </w:p>
     <w:p>
@@ -1567,7 +1567,7 @@
         <w:spacing w:after="100" w:before="220"/>
       </w:pPr>
       <w:r>
-        <w:t xml:space="preserve">3. Evacuation, assembly and dependent patients</w:t>
+        <w:t xml:space="preserve">5.3 Evacuation, assembly and dependent patients</w:t>
       </w:r>
     </w:p>
     <w:p>
@@ -1636,7 +1636,7 @@
         <w:spacing w:after="100" w:before="220"/>
       </w:pPr>
       <w:r>
-        <w:t xml:space="preserve">4. Named non-fire emergencies</w:t>
+        <w:t xml:space="preserve">5.4 Named non-fire emergencies</w:t>
       </w:r>
     </w:p>
     <w:p>
@@ -1720,7 +1720,7 @@
           <w:sz w:val="22"/>
           <w:szCs w:val="22"/>
         </w:rPr>
-        <w:t xml:space="preserve">Major electrical failure after backup has failed. Continuity decisions in section 8 apply. This is not the routine generator test.</w:t>
+        <w:t xml:space="preserve">Major electrical failure after backup has failed. Continuity decisions in section 5.8 apply. This is not the routine generator test.</w:t>
       </w:r>
     </w:p>
     <w:p>
@@ -1741,7 +1741,7 @@
         <w:spacing w:after="100" w:before="220"/>
       </w:pPr>
       <w:r>
-        <w:t xml:space="preserve">5. Exit plan — documented and displayed</w:t>
+        <w:t xml:space="preserve">5.5 Exit plan — documented and displayed</w:t>
       </w:r>
     </w:p>
     <w:p>
@@ -1786,7 +1786,7 @@
         <w:spacing w:after="100" w:before="220"/>
       </w:pPr>
       <w:r>
-        <w:t xml:space="preserve">6. Maintenance of fire-related equipment and infrastructure</w:t>
+        <w:t xml:space="preserve">5.6 Maintenance of fire-related equipment and infrastructure</w:t>
       </w:r>
     </w:p>
     <w:p>
@@ -1933,7 +1933,7 @@
         <w:spacing w:after="100" w:before="220"/>
       </w:pPr>
       <w:r>
-        <w:t xml:space="preserve">7. Mock drills</w:t>
+        <w:t xml:space="preserve">5.7 Mock drills</w:t>
       </w:r>
     </w:p>
     <w:p>
@@ -2036,7 +2036,7 @@
         <w:spacing w:after="100" w:before="220"/>
       </w:pPr>
       <w:r>
-        <w:t xml:space="preserve">8. Service continuity</w:t>
+        <w:t xml:space="preserve">5.8 Service continuity</w:t>
       </w:r>
     </w:p>
     <w:p>
@@ -2121,63 +2121,6 @@
           <w:szCs w:val="22"/>
         </w:rPr>
         <w:t xml:space="preserve">Who cannot be moved without piped oxygen is listed on the continuity card held at the «Nursing Station» and updated when a ventilator-dependent patient is admitted or discharged.</w:t>
-      </w:r>
-    </w:p>
-    <w:p>
-      <w:pPr>
-        <w:pStyle w:val="Heading2"/>
-        <w:spacing w:after="100" w:before="220"/>
-      </w:pPr>
-      <w:r>
-        <w:t xml:space="preserve">9. Stop-work authority</w:t>
-      </w:r>
-    </w:p>
-    <w:p>
-      <w:pPr>
-        <w:spacing w:after="140"/>
-      </w:pPr>
-      <w:r>
-        <w:rPr>
-          <w:sz w:val="22"/>
-          <w:szCs w:val="22"/>
-        </w:rPr>
-        <w:t xml:space="preserve">Every person on the premises has the authority and the duty to stop an act that breaches a non-negotiable rule of this policy: a blocked exit, a wedged fire door, a silenced detector, an untrained person at the fire panel, a sparking tool in an oxygen area, a drill being paper-signed.</w:t>
-      </w:r>
-    </w:p>
-    <w:p>
-      <w:pPr>
-        <w:spacing w:after="140"/>
-      </w:pPr>
-      <w:r>
-        <w:rPr>
-          <w:sz w:val="22"/>
-          <w:szCs w:val="22"/>
-        </w:rPr>
-        <w:t xml:space="preserve">The person says "stop" to the act, makes the immediate safe condition (remove the wedge, unblock the door, restore the pin on the call point if they are competent to, or keep people away if they are not), and reports the same shift to the «Maintenance In-Charge» or the Night Duty Officer.</w:t>
-      </w:r>
-    </w:p>
-    <w:p>
-      <w:pPr>
-        <w:spacing w:after="140"/>
-      </w:pPr>
-      <w:r>
-        <w:rPr>
-          <w:sz w:val="22"/>
-          <w:szCs w:val="22"/>
-        </w:rPr>
-        <w:t xml:space="preserve">There is no retaliation for a good-faith stop-work. A stop-work that was wrong in hindsight is still recorded; the act is not restarted until the Maintenance In-Charge says so.</w:t>
-      </w:r>
-    </w:p>
-    <w:p>
-      <w:pPr>
-        <w:spacing w:after="140"/>
-      </w:pPr>
-      <w:r>
-        <w:rPr>
-          <w:sz w:val="22"/>
-          <w:szCs w:val="22"/>
-        </w:rPr>
-        <w:t xml:space="preserve">A vendor or visiting consultant who refuses to stop is required to leave the area. The Medical Superintendent is informed the same shift.</w:t>
       </w:r>
     </w:p>
     <w:p>
@@ -2186,813 +2129,55 @@
         <w:spacing w:after="120" w:before="280"/>
       </w:pPr>
       <w:r>
-        <w:t xml:space="preserve">6. Governance and responsibility</w:t>
-      </w:r>
-    </w:p>
-    <w:p>
-      <w:pPr>
-        <w:spacing w:after="140"/>
-      </w:pPr>
-      <w:r>
-        <w:rPr>
-          <w:sz w:val="22"/>
-          <w:szCs w:val="22"/>
-        </w:rPr>
-        <w:t xml:space="preserve">Roles below are titles, not vacancies. If one person holds two titles in a small hospital, both duties still apply.</w:t>
-      </w:r>
-    </w:p>
-    <w:p>
-      <w:pPr>
-        <w:pStyle w:val="ListParagraph"/>
-        <w:numPr>
-          <w:ilvl w:val="0"/>
-          <w:numId w:val="1"/>
-        </w:numPr>
-        <w:spacing w:after="60"/>
-      </w:pPr>
-      <w:r>
-        <w:rPr>
-          <w:sz w:val="22"/>
-          <w:szCs w:val="22"/>
-        </w:rPr>
-        <w:t xml:space="preserve">Medical Superintendent (Head of the Institution)</w:t>
-      </w:r>
-    </w:p>
-    <w:p>
-      <w:pPr>
-        <w:pStyle w:val="ListParagraph"/>
-        <w:numPr>
-          <w:ilvl w:val="0"/>
-          <w:numId w:val="1"/>
-        </w:numPr>
-        <w:spacing w:after="60"/>
-      </w:pPr>
-      <w:r>
-        <w:rPr>
-          <w:sz w:val="22"/>
-          <w:szCs w:val="22"/>
-        </w:rPr>
-        <w:t xml:space="preserve">Accountable that this policy is issued, resourced and followed.</w:t>
-      </w:r>
-    </w:p>
-    <w:p>
-      <w:pPr>
-        <w:pStyle w:val="ListParagraph"/>
-        <w:numPr>
-          <w:ilvl w:val="0"/>
-          <w:numId w:val="1"/>
-        </w:numPr>
-        <w:spacing w:after="60"/>
-      </w:pPr>
-      <w:r>
-        <w:rPr>
-          <w:sz w:val="22"/>
-          <w:szCs w:val="22"/>
-        </w:rPr>
-        <w:t xml:space="preserve">Declares evacuate, shelter, continuity or divert by day.</w:t>
-      </w:r>
-    </w:p>
-    <w:p>
-      <w:pPr>
-        <w:pStyle w:val="ListParagraph"/>
-        <w:numPr>
-          <w:ilvl w:val="0"/>
-          <w:numId w:val="1"/>
-        </w:numPr>
-        <w:spacing w:after="60"/>
-      </w:pPr>
-      <w:r>
-        <w:rPr>
-          <w:sz w:val="22"/>
-          <w:szCs w:val="22"/>
-        </w:rPr>
-        <w:t xml:space="preserve">Accepts in writing any residual risk while a failed fire provision has a compensating arrangement.</w:t>
-      </w:r>
-    </w:p>
-    <w:p>
-      <w:pPr>
-        <w:pStyle w:val="ListParagraph"/>
-        <w:numPr>
-          <w:ilvl w:val="0"/>
-          <w:numId w:val="1"/>
-        </w:numPr>
-        <w:spacing w:after="60"/>
-      </w:pPr>
-      <w:r>
-        <w:rPr>
-          <w:sz w:val="22"/>
-          <w:szCs w:val="22"/>
-        </w:rPr>
-        <w:t xml:space="preserve">Names the receiving hospital before this policy is issued.</w:t>
-      </w:r>
-    </w:p>
-    <w:p>
-      <w:pPr>
-        <w:pStyle w:val="ListParagraph"/>
-        <w:numPr>
-          <w:ilvl w:val="0"/>
-          <w:numId w:val="1"/>
-        </w:numPr>
-        <w:spacing w:after="60"/>
-      </w:pPr>
-      <w:r>
-        <w:rPr>
-          <w:sz w:val="22"/>
-          <w:szCs w:val="22"/>
-        </w:rPr>
-        <w:t xml:space="preserve">Chooses and rotates the annual non-fire drill event.</w:t>
-      </w:r>
-    </w:p>
-    <w:p>
-      <w:pPr>
-        <w:pStyle w:val="ListParagraph"/>
-        <w:numPr>
-          <w:ilvl w:val="0"/>
-          <w:numId w:val="1"/>
-        </w:numPr>
-        <w:spacing w:after="60"/>
-      </w:pPr>
-      <w:r>
-        <w:rPr>
-          <w:sz w:val="22"/>
-          <w:szCs w:val="22"/>
-        </w:rPr>
-        <w:t xml:space="preserve">Maintenance In-Charge (Fire Safety Officer for this policy)</w:t>
-      </w:r>
-    </w:p>
-    <w:p>
-      <w:pPr>
-        <w:pStyle w:val="ListParagraph"/>
-        <w:numPr>
-          <w:ilvl w:val="0"/>
-          <w:numId w:val="1"/>
-        </w:numPr>
-        <w:spacing w:after="60"/>
-      </w:pPr>
-      <w:r>
-        <w:rPr>
-          <w:sz w:val="22"/>
-          <w:szCs w:val="22"/>
-        </w:rPr>
-        <w:t xml:space="preserve">Owns detection, first-attack equipment, fire doors, emergency lighting, pumps if installed, drawings and displayed exit plans.</w:t>
-      </w:r>
-    </w:p>
-    <w:p>
-      <w:pPr>
-        <w:pStyle w:val="ListParagraph"/>
-        <w:numPr>
-          <w:ilvl w:val="0"/>
-          <w:numId w:val="1"/>
-        </w:numPr>
-        <w:spacing w:after="60"/>
-      </w:pPr>
-      <w:r>
-        <w:rPr>
-          <w:sz w:val="22"/>
-          <w:szCs w:val="22"/>
-        </w:rPr>
-        <w:t xml:space="preserve">Holds the fire NOC and the as-built fire drawings.</w:t>
-      </w:r>
-    </w:p>
-    <w:p>
-      <w:pPr>
-        <w:pStyle w:val="ListParagraph"/>
-        <w:numPr>
-          <w:ilvl w:val="0"/>
-          <w:numId w:val="1"/>
-        </w:numPr>
-        <w:spacing w:after="60"/>
-      </w:pPr>
-      <w:r>
-        <w:rPr>
-          <w:sz w:val="22"/>
-          <w:szCs w:val="22"/>
-        </w:rPr>
-        <w:t xml:space="preserve">Runs the maintenance schedule in section 6 and closes fire findings from monthly facility rounds.</w:t>
-      </w:r>
-    </w:p>
-    <w:p>
-      <w:pPr>
-        <w:pStyle w:val="ListParagraph"/>
-        <w:numPr>
-          <w:ilvl w:val="0"/>
-          <w:numId w:val="1"/>
-        </w:numPr>
-        <w:spacing w:after="60"/>
-      </w:pPr>
-      <w:r>
-        <w:rPr>
-          <w:sz w:val="22"/>
-          <w:szCs w:val="22"/>
-        </w:rPr>
-        <w:t xml:space="preserve">Issues and closes isolation permits for detectors and zones.</w:t>
-      </w:r>
-    </w:p>
-    <w:p>
-      <w:pPr>
-        <w:pStyle w:val="ListParagraph"/>
-        <w:numPr>
-          <w:ilvl w:val="0"/>
-          <w:numId w:val="1"/>
-        </w:numPr>
-        <w:spacing w:after="60"/>
-      </w:pPr>
-      <w:r>
-        <w:rPr>
-          <w:sz w:val="22"/>
-          <w:szCs w:val="22"/>
-        </w:rPr>
-        <w:t xml:space="preserve">Trains and names staff who may operate pumps, panels and zone isolation.</w:t>
-      </w:r>
-    </w:p>
-    <w:p>
-      <w:pPr>
-        <w:pStyle w:val="ListParagraph"/>
-        <w:numPr>
-          <w:ilvl w:val="0"/>
-          <w:numId w:val="1"/>
-        </w:numPr>
-        <w:spacing w:after="60"/>
-      </w:pPr>
-      <w:r>
-        <w:rPr>
-          <w:sz w:val="22"/>
-          <w:szCs w:val="22"/>
-        </w:rPr>
-        <w:t xml:space="preserve">Nursing Superintendent</w:t>
-      </w:r>
-    </w:p>
-    <w:p>
-      <w:pPr>
-        <w:pStyle w:val="ListParagraph"/>
-        <w:numPr>
-          <w:ilvl w:val="0"/>
-          <w:numId w:val="1"/>
-        </w:numPr>
-        <w:spacing w:after="60"/>
-      </w:pPr>
-      <w:r>
-        <w:rPr>
-          <w:sz w:val="22"/>
-          <w:szCs w:val="22"/>
-        </w:rPr>
-        <w:t xml:space="preserve">Names Floor Fire Wardens for each occupied floor and for the night roster.</w:t>
-      </w:r>
-    </w:p>
-    <w:p>
-      <w:pPr>
-        <w:pStyle w:val="ListParagraph"/>
-        <w:numPr>
-          <w:ilvl w:val="0"/>
-          <w:numId w:val="1"/>
-        </w:numPr>
-        <w:spacing w:after="60"/>
-      </w:pPr>
-      <w:r>
-        <w:rPr>
-          <w:sz w:val="22"/>
-          <w:szCs w:val="22"/>
-        </w:rPr>
-        <w:t xml:space="preserve">Owns the dependent-patient move and the continuity card at the Nursing Station.</w:t>
-      </w:r>
-    </w:p>
-    <w:p>
-      <w:pPr>
-        <w:pStyle w:val="ListParagraph"/>
-        <w:numPr>
-          <w:ilvl w:val="0"/>
-          <w:numId w:val="1"/>
-        </w:numPr>
-        <w:spacing w:after="60"/>
-      </w:pPr>
-      <w:r>
-        <w:rPr>
-          <w:sz w:val="22"/>
-          <w:szCs w:val="22"/>
-        </w:rPr>
-        <w:t xml:space="preserve">Ensures displayed exit plans are not covered by notices.</w:t>
-      </w:r>
-    </w:p>
-    <w:p>
-      <w:pPr>
-        <w:pStyle w:val="ListParagraph"/>
-        <w:numPr>
-          <w:ilvl w:val="0"/>
-          <w:numId w:val="1"/>
-        </w:numPr>
-        <w:spacing w:after="60"/>
-      </w:pPr>
-      <w:r>
-        <w:rPr>
-          <w:sz w:val="22"/>
-          <w:szCs w:val="22"/>
-        </w:rPr>
-        <w:t xml:space="preserve">Night Duty Officer (senior doctor or senior nurse on night duty, as rostered)</w:t>
-      </w:r>
-    </w:p>
-    <w:p>
-      <w:pPr>
-        <w:pStyle w:val="ListParagraph"/>
-        <w:numPr>
-          <w:ilvl w:val="0"/>
-          <w:numId w:val="1"/>
-        </w:numPr>
-        <w:spacing w:after="60"/>
-      </w:pPr>
-      <w:r>
-        <w:rPr>
-          <w:sz w:val="22"/>
-          <w:szCs w:val="22"/>
-        </w:rPr>
-        <w:t xml:space="preserve">Holds the Medical Superintendent's emergency authority between «20:00 and 08:00».</w:t>
-      </w:r>
-    </w:p>
-    <w:p>
-      <w:pPr>
-        <w:pStyle w:val="ListParagraph"/>
-        <w:numPr>
-          <w:ilvl w:val="0"/>
-          <w:numId w:val="1"/>
-        </w:numPr>
-        <w:spacing w:after="60"/>
-      </w:pPr>
-      <w:r>
-        <w:rPr>
-          <w:sz w:val="22"/>
-          <w:szCs w:val="22"/>
-        </w:rPr>
-        <w:t xml:space="preserve">Receives the alarm, declares the event, and orders evacuate or shelter.</w:t>
-      </w:r>
-    </w:p>
-    <w:p>
-      <w:pPr>
-        <w:pStyle w:val="ListParagraph"/>
-        <w:numPr>
-          <w:ilvl w:val="0"/>
-          <w:numId w:val="1"/>
-        </w:numPr>
-        <w:spacing w:after="60"/>
-      </w:pPr>
-      <w:r>
-        <w:rPr>
-          <w:sz w:val="22"/>
-          <w:szCs w:val="22"/>
-        </w:rPr>
-        <w:t xml:space="preserve">Does not silence the panel without a watcher on the floor.</w:t>
-      </w:r>
-    </w:p>
-    <w:p>
-      <w:pPr>
-        <w:pStyle w:val="ListParagraph"/>
-        <w:numPr>
-          <w:ilvl w:val="0"/>
-          <w:numId w:val="1"/>
-        </w:numPr>
-        <w:spacing w:after="60"/>
-      </w:pPr>
-      <w:r>
-        <w:rPr>
-          <w:sz w:val="22"/>
-          <w:szCs w:val="22"/>
-        </w:rPr>
-        <w:t xml:space="preserve">Floor Fire Warden (senior staff nurse of that floor / senior nurse on night duty for that floor)</w:t>
-      </w:r>
-    </w:p>
-    <w:p>
-      <w:pPr>
-        <w:pStyle w:val="ListParagraph"/>
-        <w:numPr>
-          <w:ilvl w:val="0"/>
-          <w:numId w:val="1"/>
-        </w:numPr>
-        <w:spacing w:after="60"/>
-      </w:pPr>
-      <w:r>
-        <w:rPr>
-          <w:sz w:val="22"/>
-          <w:szCs w:val="22"/>
-        </w:rPr>
-        <w:t xml:space="preserve">Sweeps the floor, closes fire doors on the way out, reports floor clear or patients remaining.</w:t>
-      </w:r>
-    </w:p>
-    <w:p>
-      <w:pPr>
-        <w:pStyle w:val="ListParagraph"/>
-        <w:numPr>
-          <w:ilvl w:val="0"/>
-          <w:numId w:val="1"/>
-        </w:numPr>
-        <w:spacing w:after="60"/>
-      </w:pPr>
-      <w:r>
-        <w:rPr>
-          <w:sz w:val="22"/>
-          <w:szCs w:val="22"/>
-        </w:rPr>
-        <w:t xml:space="preserve">Security Supervisor (or the person covering the Security desk)</w:t>
-      </w:r>
-    </w:p>
-    <w:p>
-      <w:pPr>
-        <w:pStyle w:val="ListParagraph"/>
-        <w:numPr>
-          <w:ilvl w:val="0"/>
-          <w:numId w:val="1"/>
-        </w:numPr>
-        <w:spacing w:after="60"/>
-      </w:pPr>
-      <w:r>
-        <w:rPr>
-          <w:sz w:val="22"/>
-          <w:szCs w:val="22"/>
-        </w:rPr>
-        <w:t xml:space="preserve">Hears the panel, calls the fire service on a confirmed or un-ruled-out fire: «101 / local fire-station number held at the desk».</w:t>
-      </w:r>
-    </w:p>
-    <w:p>
-      <w:pPr>
-        <w:pStyle w:val="ListParagraph"/>
-        <w:numPr>
-          <w:ilvl w:val="0"/>
-          <w:numId w:val="1"/>
-        </w:numPr>
-        <w:spacing w:after="60"/>
-      </w:pPr>
-      <w:r>
-        <w:rPr>
-          <w:sz w:val="22"/>
-          <w:szCs w:val="22"/>
-        </w:rPr>
-        <w:t xml:space="preserve">Controls the assembly-point count against the duty roster.</w:t>
-      </w:r>
-    </w:p>
-    <w:p>
-      <w:pPr>
-        <w:pStyle w:val="ListParagraph"/>
-        <w:numPr>
-          <w:ilvl w:val="0"/>
-          <w:numId w:val="1"/>
-        </w:numPr>
-        <w:spacing w:after="60"/>
-      </w:pPr>
-      <w:r>
-        <w:rPr>
-          <w:sz w:val="22"/>
-          <w:szCs w:val="22"/>
-        </w:rPr>
-        <w:t xml:space="preserve">Keeps vehicle access clear for fire appliances.</w:t>
-      </w:r>
-    </w:p>
-    <w:p>
-      <w:pPr>
-        <w:pStyle w:val="ListParagraph"/>
-        <w:numPr>
-          <w:ilvl w:val="0"/>
-          <w:numId w:val="1"/>
-        </w:numPr>
-        <w:spacing w:after="60"/>
-      </w:pPr>
-      <w:r>
-        <w:rPr>
-          <w:sz w:val="22"/>
-          <w:szCs w:val="22"/>
-        </w:rPr>
-        <w:t xml:space="preserve">Quality Coordinator</w:t>
-      </w:r>
-    </w:p>
-    <w:p>
-      <w:pPr>
-        <w:pStyle w:val="ListParagraph"/>
-        <w:numPr>
-          <w:ilvl w:val="0"/>
-          <w:numId w:val="1"/>
-        </w:numPr>
-        <w:spacing w:after="60"/>
-      </w:pPr>
-      <w:r>
-        <w:rPr>
-          <w:sz w:val="22"/>
-          <w:szCs w:val="22"/>
-        </w:rPr>
-        <w:t xml:space="preserve">Observes drills, holds the drill file, tracks failed objectives to re-drill.</w:t>
-      </w:r>
-    </w:p>
-    <w:p>
-      <w:pPr>
-        <w:pStyle w:val="ListParagraph"/>
-        <w:numPr>
-          <w:ilvl w:val="0"/>
-          <w:numId w:val="1"/>
-        </w:numPr>
-        <w:spacing w:after="60"/>
-      </w:pPr>
-      <w:r>
-        <w:rPr>
-          <w:sz w:val="22"/>
-          <w:szCs w:val="22"/>
-        </w:rPr>
-        <w:t xml:space="preserve">Audits this policy «quarterly» (see monitoring).</w:t>
-      </w:r>
-    </w:p>
-    <w:p>
-      <w:pPr>
-        <w:pStyle w:val="ListParagraph"/>
-        <w:numPr>
-          <w:ilvl w:val="0"/>
-          <w:numId w:val="1"/>
-        </w:numPr>
-        <w:spacing w:after="60"/>
-      </w:pPr>
-      <w:r>
-        <w:rPr>
-          <w:sz w:val="22"/>
-          <w:szCs w:val="22"/>
-        </w:rPr>
-        <w:t xml:space="preserve">Dual-enters a fire, a failed drill that caused harm, or a stop-work that became an incident, in the incident system.</w:t>
-      </w:r>
-    </w:p>
-    <w:p>
-      <w:pPr>
-        <w:pStyle w:val="ListParagraph"/>
-        <w:numPr>
-          <w:ilvl w:val="0"/>
-          <w:numId w:val="1"/>
-        </w:numPr>
-        <w:spacing w:after="60"/>
-      </w:pPr>
-      <w:r>
-        <w:rPr>
-          <w:sz w:val="22"/>
-          <w:szCs w:val="22"/>
-        </w:rPr>
-        <w:t xml:space="preserve">Department in-charges (theatre, labour, laboratory, imaging, pharmacy, kitchen)</w:t>
-      </w:r>
-    </w:p>
-    <w:p>
-      <w:pPr>
-        <w:pStyle w:val="ListParagraph"/>
-        <w:numPr>
-          <w:ilvl w:val="0"/>
-          <w:numId w:val="1"/>
-        </w:numPr>
-        <w:spacing w:after="60"/>
-      </w:pPr>
-      <w:r>
-        <w:rPr>
-          <w:sz w:val="22"/>
-          <w:szCs w:val="22"/>
-        </w:rPr>
-        <w:t xml:space="preserve">Evacuate or shelter their unit on order; do not continue elective work through a fire alarm.</w:t>
-      </w:r>
-    </w:p>
-    <w:p>
-      <w:pPr>
-        <w:pStyle w:val="ListParagraph"/>
-        <w:numPr>
-          <w:ilvl w:val="0"/>
-          <w:numId w:val="1"/>
-        </w:numPr>
-        <w:spacing w:after="60"/>
-      </w:pPr>
-      <w:r>
-        <w:rPr>
-          <w:sz w:val="22"/>
-          <w:szCs w:val="22"/>
-        </w:rPr>
-        <w:t xml:space="preserve">Laboratory fire follows this plan.</w:t>
-      </w:r>
-    </w:p>
-    <w:p>
-      <w:pPr>
-        <w:pStyle w:val="ListParagraph"/>
-        <w:numPr>
-          <w:ilvl w:val="0"/>
-          <w:numId w:val="1"/>
-        </w:numPr>
-        <w:spacing w:after="60"/>
-      </w:pPr>
-      <w:r>
-        <w:rPr>
-          <w:sz w:val="22"/>
-          <w:szCs w:val="22"/>
-        </w:rPr>
-        <w:t xml:space="preserve">All staff, vendors and visiting consultants</w:t>
-      </w:r>
-    </w:p>
-    <w:p>
-      <w:pPr>
-        <w:pStyle w:val="ListParagraph"/>
-        <w:numPr>
-          <w:ilvl w:val="0"/>
-          <w:numId w:val="1"/>
-        </w:numPr>
-        <w:spacing w:after="60"/>
-      </w:pPr>
-      <w:r>
-        <w:rPr>
-          <w:sz w:val="22"/>
-          <w:szCs w:val="22"/>
-        </w:rPr>
-        <w:t xml:space="preserve">Know the route from their workplace to the assembly point.</w:t>
-      </w:r>
-    </w:p>
-    <w:p>
-      <w:pPr>
-        <w:pStyle w:val="ListParagraph"/>
-        <w:numPr>
-          <w:ilvl w:val="0"/>
-          <w:numId w:val="1"/>
-        </w:numPr>
-        <w:spacing w:after="60"/>
-      </w:pPr>
-      <w:r>
-        <w:rPr>
-          <w:sz w:val="22"/>
-          <w:szCs w:val="22"/>
-        </w:rPr>
-        <w:t xml:space="preserve">Obey stop-work and the non-negotiable rules.</w:t>
-      </w:r>
-    </w:p>
-    <w:p>
-      <w:pPr>
-        <w:pStyle w:val="ListParagraph"/>
-        <w:numPr>
-          <w:ilvl w:val="0"/>
-          <w:numId w:val="1"/>
-        </w:numPr>
-        <w:spacing w:after="60"/>
-      </w:pPr>
-      <w:r>
-        <w:rPr>
-          <w:sz w:val="22"/>
-          <w:szCs w:val="22"/>
-        </w:rPr>
-        <w:t xml:space="preserve">Do not operate fire equipment they have not been trained to operate.</w:t>
-      </w:r>
-    </w:p>
-    <w:p>
-      <w:pPr>
-        <w:spacing w:after="140"/>
-      </w:pPr>
-      <w:r>
-        <w:rPr>
-          <w:sz w:val="22"/>
-          <w:szCs w:val="22"/>
-        </w:rPr>
-        <w:t xml:space="preserve">A RACI snapshot:</w:t>
-      </w:r>
-    </w:p>
-    <w:p>
-      <w:pPr>
-        <w:pStyle w:val="ListParagraph"/>
-        <w:numPr>
-          <w:ilvl w:val="0"/>
-          <w:numId w:val="1"/>
-        </w:numPr>
-        <w:spacing w:after="60"/>
-      </w:pPr>
-      <w:r>
-        <w:rPr>
-          <w:sz w:val="22"/>
-          <w:szCs w:val="22"/>
-        </w:rPr>
-        <w:t xml:space="preserve">Alarm raised: all staff (R); Night Duty Officer / Medical Superintendent (A)</w:t>
-      </w:r>
-    </w:p>
-    <w:p>
-      <w:pPr>
-        <w:pStyle w:val="ListParagraph"/>
-        <w:numPr>
-          <w:ilvl w:val="0"/>
-          <w:numId w:val="1"/>
-        </w:numPr>
-        <w:spacing w:after="60"/>
-      </w:pPr>
-      <w:r>
-        <w:rPr>
-          <w:sz w:val="22"/>
-          <w:szCs w:val="22"/>
-        </w:rPr>
-        <w:t xml:space="preserve">First attack: trained staff on that floor (R); Maintenance In-Charge (A for equipment)</w:t>
-      </w:r>
-    </w:p>
-    <w:p>
-      <w:pPr>
-        <w:pStyle w:val="ListParagraph"/>
-        <w:numPr>
-          <w:ilvl w:val="0"/>
-          <w:numId w:val="1"/>
-        </w:numPr>
-        <w:spacing w:after="60"/>
-      </w:pPr>
-      <w:r>
-        <w:rPr>
-          <w:sz w:val="22"/>
-          <w:szCs w:val="22"/>
-        </w:rPr>
-        <w:t xml:space="preserve">Evacuation sweep: Floor Fire Warden (R); Nursing Superintendent (A)</w:t>
-      </w:r>
-    </w:p>
-    <w:p>
-      <w:pPr>
-        <w:pStyle w:val="ListParagraph"/>
-        <w:numPr>
-          <w:ilvl w:val="0"/>
-          <w:numId w:val="1"/>
-        </w:numPr>
-        <w:spacing w:after="60"/>
-      </w:pPr>
-      <w:r>
-        <w:rPr>
-          <w:sz w:val="22"/>
-          <w:szCs w:val="22"/>
-        </w:rPr>
-        <w:t xml:space="preserve">Fire service called: Security Supervisor (R); Night Duty Officer (A)</w:t>
-      </w:r>
-    </w:p>
-    <w:p>
-      <w:pPr>
-        <w:pStyle w:val="ListParagraph"/>
-        <w:numPr>
-          <w:ilvl w:val="0"/>
-          <w:numId w:val="1"/>
-        </w:numPr>
-        <w:spacing w:after="60"/>
-      </w:pPr>
-      <w:r>
-        <w:rPr>
-          <w:sz w:val="22"/>
-          <w:szCs w:val="22"/>
-        </w:rPr>
-        <w:t xml:space="preserve">Isolation of power / gas: Maintenance In-Charge or trained night technician (R); Medical Superintendent / Night Duty Officer (A)</w:t>
-      </w:r>
-    </w:p>
-    <w:p>
-      <w:pPr>
-        <w:pStyle w:val="ListParagraph"/>
-        <w:numPr>
-          <w:ilvl w:val="0"/>
-          <w:numId w:val="1"/>
-        </w:numPr>
-        <w:spacing w:after="60"/>
-      </w:pPr>
-      <w:r>
-        <w:rPr>
-          <w:sz w:val="22"/>
-          <w:szCs w:val="22"/>
-        </w:rPr>
-        <w:t xml:space="preserve">Maintenance &amp; NOC: Maintenance In-Charge (R/A)</w:t>
-      </w:r>
-    </w:p>
-    <w:p>
-      <w:pPr>
-        <w:pStyle w:val="ListParagraph"/>
-        <w:numPr>
-          <w:ilvl w:val="0"/>
-          <w:numId w:val="1"/>
-        </w:numPr>
-        <w:spacing w:after="60"/>
-      </w:pPr>
-      <w:r>
-        <w:rPr>
-          <w:sz w:val="22"/>
-          <w:szCs w:val="22"/>
-        </w:rPr>
-        <w:t xml:space="preserve">Drills: Quality Coordinator (R for observation); Medical Superintendent (A)</w:t>
-      </w:r>
-    </w:p>
-    <w:p>
-      <w:pPr>
-        <w:pStyle w:val="ListParagraph"/>
-        <w:numPr>
-          <w:ilvl w:val="0"/>
-          <w:numId w:val="1"/>
-        </w:numPr>
-        <w:spacing w:after="60"/>
-      </w:pPr>
-      <w:r>
-        <w:rPr>
-          <w:sz w:val="22"/>
-          <w:szCs w:val="22"/>
-        </w:rPr>
-        <w:t xml:space="preserve">Continuity / divert: Medical Superintendent or Night Duty Officer (R/A)</w:t>
-      </w:r>
-    </w:p>
-    <w:p>
-      <w:pPr>
-        <w:pStyle w:val="ListParagraph"/>
-        <w:numPr>
-          <w:ilvl w:val="0"/>
-          <w:numId w:val="1"/>
-        </w:numPr>
-        <w:spacing w:after="60"/>
-      </w:pPr>
-      <w:r>
-        <w:rPr>
-          <w:sz w:val="22"/>
-          <w:szCs w:val="22"/>
-        </w:rPr>
-        <w:t xml:space="preserve">Stop-work: all staff (R); Maintenance In-Charge (A for restart)</w:t>
+        <w:t xml:space="preserve">6. Stop-work authority</w:t>
+      </w:r>
+    </w:p>
+    <w:p>
+      <w:pPr>
+        <w:spacing w:after="140"/>
+      </w:pPr>
+      <w:r>
+        <w:rPr>
+          <w:sz w:val="22"/>
+          <w:szCs w:val="22"/>
+        </w:rPr>
+        <w:t xml:space="preserve">Every person on the premises has the authority and the duty to stop an act that breaches a non-negotiable rule of this policy: a blocked exit, a wedged fire door, a silenced detector, an untrained person at the fire panel, a sparking tool in an oxygen area, a drill being paper-signed.</w:t>
+      </w:r>
+    </w:p>
+    <w:p>
+      <w:pPr>
+        <w:spacing w:after="140"/>
+      </w:pPr>
+      <w:r>
+        <w:rPr>
+          <w:sz w:val="22"/>
+          <w:szCs w:val="22"/>
+        </w:rPr>
+        <w:t xml:space="preserve">The person says "stop" to the act, makes the immediate safe condition (remove the wedge, unblock the door, restore the pin on the call point if they are competent to, or keep people away if they are not), and reports the same shift to the «Maintenance In-Charge» or the Night Duty Officer.</w:t>
+      </w:r>
+    </w:p>
+    <w:p>
+      <w:pPr>
+        <w:spacing w:after="140"/>
+      </w:pPr>
+      <w:r>
+        <w:rPr>
+          <w:sz w:val="22"/>
+          <w:szCs w:val="22"/>
+        </w:rPr>
+        <w:t xml:space="preserve">There is no retaliation for a good-faith stop-work. A stop-work that was wrong in hindsight is still recorded; the act is not restarted until the Maintenance In-Charge says so.</w:t>
+      </w:r>
+    </w:p>
+    <w:p>
+      <w:pPr>
+        <w:spacing w:after="140"/>
+      </w:pPr>
+      <w:r>
+        <w:rPr>
+          <w:sz w:val="22"/>
+          <w:szCs w:val="22"/>
+        </w:rPr>
+        <w:t xml:space="preserve">A vendor or visiting consultant who refuses to stop is required to leave the area. The Medical Superintendent is informed the same shift.</w:t>
       </w:r>
     </w:p>
     <w:p>
@@ -3001,203 +2186,813 @@
         <w:spacing w:after="120" w:before="280"/>
       </w:pPr>
       <w:r>
-        <w:t xml:space="preserve">7. Quality monitoring (RCA → CAPA)</w:t>
-      </w:r>
-    </w:p>
-    <w:p>
-      <w:pPr>
-        <w:spacing w:after="140"/>
-      </w:pPr>
-      <w:r>
-        <w:rPr>
-          <w:sz w:val="22"/>
-          <w:szCs w:val="22"/>
-        </w:rPr>
-        <w:t xml:space="preserve">The Quality Coordinator audits this policy «quarterly», and after every real activation or failed drill. The audit looks at the provisions and the records, not at a binder.</w:t>
-      </w:r>
-    </w:p>
-    <w:p>
-      <w:pPr>
-        <w:spacing w:after="140"/>
-      </w:pPr>
-      <w:r>
-        <w:rPr>
-          <w:sz w:val="22"/>
-          <w:szCs w:val="22"/>
-        </w:rPr>
-        <w:t xml:space="preserve">What is monitored each quarter:</w:t>
-      </w:r>
-    </w:p>
-    <w:p>
-      <w:pPr>
-        <w:pStyle w:val="ListParagraph"/>
-        <w:numPr>
-          <w:ilvl w:val="0"/>
-          <w:numId w:val="1"/>
-        </w:numPr>
-        <w:spacing w:after="60"/>
-      </w:pPr>
-      <w:r>
-        <w:rPr>
-          <w:sz w:val="22"/>
-          <w:szCs w:val="22"/>
-        </w:rPr>
-        <w:t xml:space="preserve">Extinguishers: monthly visual sheets for the quarter; any gauge in the red closed the same shift.</w:t>
-      </w:r>
-    </w:p>
-    <w:p>
-      <w:pPr>
-        <w:pStyle w:val="ListParagraph"/>
-        <w:numPr>
-          <w:ilvl w:val="0"/>
-          <w:numId w:val="1"/>
-        </w:numPr>
-        <w:spacing w:after="60"/>
-      </w:pPr>
-      <w:r>
-        <w:rPr>
-          <w:sz w:val="22"/>
-          <w:szCs w:val="22"/>
-        </w:rPr>
-        <w:t xml:space="preserve">Detectors and panel: last quarterly functional test; any isolated zone has a current permit and a watcher.</w:t>
-      </w:r>
-    </w:p>
-    <w:p>
-      <w:pPr>
-        <w:pStyle w:val="ListParagraph"/>
-        <w:numPr>
-          <w:ilvl w:val="0"/>
-          <w:numId w:val="1"/>
-        </w:numPr>
-        <w:spacing w:after="60"/>
-      </w:pPr>
-      <w:r>
-        <w:rPr>
-          <w:sz w:val="22"/>
-          <w:szCs w:val="22"/>
-        </w:rPr>
-        <w:t xml:space="preserve">Fire doors: monthly round findings closed; no door on a watcher older than «24 hours» without Medical Superintendent sign-off.</w:t>
-      </w:r>
-    </w:p>
-    <w:p>
-      <w:pPr>
-        <w:pStyle w:val="ListParagraph"/>
-        <w:numPr>
-          <w:ilvl w:val="0"/>
-          <w:numId w:val="1"/>
-        </w:numPr>
-        <w:spacing w:after="60"/>
-      </w:pPr>
-      <w:r>
-        <w:rPr>
-          <w:sz w:val="22"/>
-          <w:szCs w:val="22"/>
-        </w:rPr>
-        <w:t xml:space="preserve">Exit displays: still match the drawings; assembly point still as issued.</w:t>
-      </w:r>
-    </w:p>
-    <w:p>
-      <w:pPr>
-        <w:pStyle w:val="ListParagraph"/>
-        <w:numPr>
-          <w:ilvl w:val="0"/>
-          <w:numId w:val="1"/>
-        </w:numPr>
-        <w:spacing w:after="60"/>
-      </w:pPr>
-      <w:r>
-        <w:rPr>
-          <w:sz w:val="22"/>
-          <w:szCs w:val="22"/>
-        </w:rPr>
-        <w:t xml:space="preserve">Drill calendar: two drills dated in the last twelve months, one fire and one named non-fire, one of them night or weekend; dependent-patient move recorded; failed objectives re-drilled inside thirty days.</w:t>
-      </w:r>
-    </w:p>
-    <w:p>
-      <w:pPr>
-        <w:pStyle w:val="ListParagraph"/>
-        <w:numPr>
-          <w:ilvl w:val="0"/>
-          <w:numId w:val="1"/>
-        </w:numPr>
-        <w:spacing w:after="60"/>
-      </w:pPr>
-      <w:r>
-        <w:rPr>
-          <w:sz w:val="22"/>
-          <w:szCs w:val="22"/>
-        </w:rPr>
-        <w:t xml:space="preserve">Continuity card: receiving hospital named; oxygen-dependent in-patients listed.</w:t>
-      </w:r>
-    </w:p>
-    <w:p>
-      <w:pPr>
-        <w:pStyle w:val="ListParagraph"/>
-        <w:numPr>
-          <w:ilvl w:val="0"/>
-          <w:numId w:val="1"/>
-        </w:numPr>
-        <w:spacing w:after="60"/>
-      </w:pPr>
-      <w:r>
-        <w:rPr>
-          <w:sz w:val="22"/>
-          <w:szCs w:val="22"/>
-        </w:rPr>
-        <w:t xml:space="preserve">Stop-work and incident dual-entry: every activation and every stop-work that met the incident definition is in the incident file.</w:t>
-      </w:r>
-    </w:p>
-    <w:p>
-      <w:pPr>
-        <w:pStyle w:val="ListParagraph"/>
-        <w:numPr>
-          <w:ilvl w:val="0"/>
-          <w:numId w:val="1"/>
-        </w:numPr>
-        <w:spacing w:after="60"/>
-      </w:pPr>
-      <w:r>
-        <w:rPr>
-          <w:sz w:val="22"/>
-          <w:szCs w:val="22"/>
-        </w:rPr>
-        <w:t xml:space="preserve">Fire NOC: still current.</w:t>
-      </w:r>
-    </w:p>
-    <w:p>
-      <w:pPr>
-        <w:spacing w:after="140"/>
-      </w:pPr>
-      <w:r>
-        <w:rPr>
-          <w:sz w:val="22"/>
-          <w:szCs w:val="22"/>
-        </w:rPr>
-        <w:t xml:space="preserve">Any non-conformity is a finding. The Maintenance In-Charge (equipment and fabric) or the Nursing Superintendent (wardens, displays, dependent-patient move) owns the corrective action. Root-cause analysis is required when: a drill objective fails twice; a real alarm is not heard at the Nursing Station; a fire door is found wedged on two successive rounds; an extinguisher is found discharged or missing; or a person operated a pump, panel or gas isolation without being on the trained list.</w:t>
-      </w:r>
-    </w:p>
-    <w:p>
-      <w:pPr>
-        <w:spacing w:after="140"/>
-      </w:pPr>
-      <w:r>
-        <w:rPr>
-          <w:sz w:val="22"/>
-          <w:szCs w:val="22"/>
-        </w:rPr>
-        <w:t xml:space="preserve">Corrective and preventive action is dated, has an owner, and is checked at the next quarterly audit. An open CAPA older than «thirty days» is escalated to the Medical Superintendent.</w:t>
-      </w:r>
-    </w:p>
-    <w:p>
-      <w:pPr>
-        <w:spacing w:after="140"/>
-      </w:pPr>
-      <w:r>
-        <w:rPr>
-          <w:sz w:val="22"/>
-          <w:szCs w:val="22"/>
-        </w:rPr>
-        <w:t xml:space="preserve">This policy is reviewed «annually», and sooner after a real fire, a failed drill, a change to the fire NOC, a change of assembly point, or a change to the receiving hospital.</w:t>
+        <w:t xml:space="preserve">7. Governance and responsibility</w:t>
+      </w:r>
+    </w:p>
+    <w:p>
+      <w:pPr>
+        <w:spacing w:after="140"/>
+      </w:pPr>
+      <w:r>
+        <w:rPr>
+          <w:sz w:val="22"/>
+          <w:szCs w:val="22"/>
+        </w:rPr>
+        <w:t xml:space="preserve">Roles below are titles, not vacancies. If one person holds two titles in a small hospital, both duties still apply.</w:t>
+      </w:r>
+    </w:p>
+    <w:p>
+      <w:pPr>
+        <w:pStyle w:val="ListParagraph"/>
+        <w:numPr>
+          <w:ilvl w:val="0"/>
+          <w:numId w:val="1"/>
+        </w:numPr>
+        <w:spacing w:after="60"/>
+      </w:pPr>
+      <w:r>
+        <w:rPr>
+          <w:sz w:val="22"/>
+          <w:szCs w:val="22"/>
+        </w:rPr>
+        <w:t xml:space="preserve">Medical Superintendent (Head of the Institution)</w:t>
+      </w:r>
+    </w:p>
+    <w:p>
+      <w:pPr>
+        <w:pStyle w:val="ListParagraph"/>
+        <w:numPr>
+          <w:ilvl w:val="0"/>
+          <w:numId w:val="1"/>
+        </w:numPr>
+        <w:spacing w:after="60"/>
+      </w:pPr>
+      <w:r>
+        <w:rPr>
+          <w:sz w:val="22"/>
+          <w:szCs w:val="22"/>
+        </w:rPr>
+        <w:t xml:space="preserve">Accountable that this policy is issued, resourced and followed.</w:t>
+      </w:r>
+    </w:p>
+    <w:p>
+      <w:pPr>
+        <w:pStyle w:val="ListParagraph"/>
+        <w:numPr>
+          <w:ilvl w:val="0"/>
+          <w:numId w:val="1"/>
+        </w:numPr>
+        <w:spacing w:after="60"/>
+      </w:pPr>
+      <w:r>
+        <w:rPr>
+          <w:sz w:val="22"/>
+          <w:szCs w:val="22"/>
+        </w:rPr>
+        <w:t xml:space="preserve">Declares evacuate, shelter, continuity or divert by day.</w:t>
+      </w:r>
+    </w:p>
+    <w:p>
+      <w:pPr>
+        <w:pStyle w:val="ListParagraph"/>
+        <w:numPr>
+          <w:ilvl w:val="0"/>
+          <w:numId w:val="1"/>
+        </w:numPr>
+        <w:spacing w:after="60"/>
+      </w:pPr>
+      <w:r>
+        <w:rPr>
+          <w:sz w:val="22"/>
+          <w:szCs w:val="22"/>
+        </w:rPr>
+        <w:t xml:space="preserve">Accepts in writing any residual risk while a failed fire provision has a compensating arrangement.</w:t>
+      </w:r>
+    </w:p>
+    <w:p>
+      <w:pPr>
+        <w:pStyle w:val="ListParagraph"/>
+        <w:numPr>
+          <w:ilvl w:val="0"/>
+          <w:numId w:val="1"/>
+        </w:numPr>
+        <w:spacing w:after="60"/>
+      </w:pPr>
+      <w:r>
+        <w:rPr>
+          <w:sz w:val="22"/>
+          <w:szCs w:val="22"/>
+        </w:rPr>
+        <w:t xml:space="preserve">Names the receiving hospital before this policy is issued.</w:t>
+      </w:r>
+    </w:p>
+    <w:p>
+      <w:pPr>
+        <w:pStyle w:val="ListParagraph"/>
+        <w:numPr>
+          <w:ilvl w:val="0"/>
+          <w:numId w:val="1"/>
+        </w:numPr>
+        <w:spacing w:after="60"/>
+      </w:pPr>
+      <w:r>
+        <w:rPr>
+          <w:sz w:val="22"/>
+          <w:szCs w:val="22"/>
+        </w:rPr>
+        <w:t xml:space="preserve">Chooses and rotates the annual non-fire drill event.</w:t>
+      </w:r>
+    </w:p>
+    <w:p>
+      <w:pPr>
+        <w:pStyle w:val="ListParagraph"/>
+        <w:numPr>
+          <w:ilvl w:val="0"/>
+          <w:numId w:val="1"/>
+        </w:numPr>
+        <w:spacing w:after="60"/>
+      </w:pPr>
+      <w:r>
+        <w:rPr>
+          <w:sz w:val="22"/>
+          <w:szCs w:val="22"/>
+        </w:rPr>
+        <w:t xml:space="preserve">Maintenance In-Charge (Fire Safety Officer for this policy)</w:t>
+      </w:r>
+    </w:p>
+    <w:p>
+      <w:pPr>
+        <w:pStyle w:val="ListParagraph"/>
+        <w:numPr>
+          <w:ilvl w:val="0"/>
+          <w:numId w:val="1"/>
+        </w:numPr>
+        <w:spacing w:after="60"/>
+      </w:pPr>
+      <w:r>
+        <w:rPr>
+          <w:sz w:val="22"/>
+          <w:szCs w:val="22"/>
+        </w:rPr>
+        <w:t xml:space="preserve">Owns detection, first-attack equipment, fire doors, emergency lighting, pumps if installed, drawings and displayed exit plans.</w:t>
+      </w:r>
+    </w:p>
+    <w:p>
+      <w:pPr>
+        <w:pStyle w:val="ListParagraph"/>
+        <w:numPr>
+          <w:ilvl w:val="0"/>
+          <w:numId w:val="1"/>
+        </w:numPr>
+        <w:spacing w:after="60"/>
+      </w:pPr>
+      <w:r>
+        <w:rPr>
+          <w:sz w:val="22"/>
+          <w:szCs w:val="22"/>
+        </w:rPr>
+        <w:t xml:space="preserve">Holds the fire NOC and the as-built fire drawings.</w:t>
+      </w:r>
+    </w:p>
+    <w:p>
+      <w:pPr>
+        <w:pStyle w:val="ListParagraph"/>
+        <w:numPr>
+          <w:ilvl w:val="0"/>
+          <w:numId w:val="1"/>
+        </w:numPr>
+        <w:spacing w:after="60"/>
+      </w:pPr>
+      <w:r>
+        <w:rPr>
+          <w:sz w:val="22"/>
+          <w:szCs w:val="22"/>
+        </w:rPr>
+        <w:t xml:space="preserve">Runs the maintenance schedule in section 5.6 and closes fire findings from monthly facility rounds.</w:t>
+      </w:r>
+    </w:p>
+    <w:p>
+      <w:pPr>
+        <w:pStyle w:val="ListParagraph"/>
+        <w:numPr>
+          <w:ilvl w:val="0"/>
+          <w:numId w:val="1"/>
+        </w:numPr>
+        <w:spacing w:after="60"/>
+      </w:pPr>
+      <w:r>
+        <w:rPr>
+          <w:sz w:val="22"/>
+          <w:szCs w:val="22"/>
+        </w:rPr>
+        <w:t xml:space="preserve">Issues and closes isolation permits for detectors and zones.</w:t>
+      </w:r>
+    </w:p>
+    <w:p>
+      <w:pPr>
+        <w:pStyle w:val="ListParagraph"/>
+        <w:numPr>
+          <w:ilvl w:val="0"/>
+          <w:numId w:val="1"/>
+        </w:numPr>
+        <w:spacing w:after="60"/>
+      </w:pPr>
+      <w:r>
+        <w:rPr>
+          <w:sz w:val="22"/>
+          <w:szCs w:val="22"/>
+        </w:rPr>
+        <w:t xml:space="preserve">Trains and names staff who may operate pumps, panels and zone isolation.</w:t>
+      </w:r>
+    </w:p>
+    <w:p>
+      <w:pPr>
+        <w:pStyle w:val="ListParagraph"/>
+        <w:numPr>
+          <w:ilvl w:val="0"/>
+          <w:numId w:val="1"/>
+        </w:numPr>
+        <w:spacing w:after="60"/>
+      </w:pPr>
+      <w:r>
+        <w:rPr>
+          <w:sz w:val="22"/>
+          <w:szCs w:val="22"/>
+        </w:rPr>
+        <w:t xml:space="preserve">Nursing Superintendent</w:t>
+      </w:r>
+    </w:p>
+    <w:p>
+      <w:pPr>
+        <w:pStyle w:val="ListParagraph"/>
+        <w:numPr>
+          <w:ilvl w:val="0"/>
+          <w:numId w:val="1"/>
+        </w:numPr>
+        <w:spacing w:after="60"/>
+      </w:pPr>
+      <w:r>
+        <w:rPr>
+          <w:sz w:val="22"/>
+          <w:szCs w:val="22"/>
+        </w:rPr>
+        <w:t xml:space="preserve">Names Floor Fire Wardens for each occupied floor and for the night roster.</w:t>
+      </w:r>
+    </w:p>
+    <w:p>
+      <w:pPr>
+        <w:pStyle w:val="ListParagraph"/>
+        <w:numPr>
+          <w:ilvl w:val="0"/>
+          <w:numId w:val="1"/>
+        </w:numPr>
+        <w:spacing w:after="60"/>
+      </w:pPr>
+      <w:r>
+        <w:rPr>
+          <w:sz w:val="22"/>
+          <w:szCs w:val="22"/>
+        </w:rPr>
+        <w:t xml:space="preserve">Owns the dependent-patient move and the continuity card at the Nursing Station.</w:t>
+      </w:r>
+    </w:p>
+    <w:p>
+      <w:pPr>
+        <w:pStyle w:val="ListParagraph"/>
+        <w:numPr>
+          <w:ilvl w:val="0"/>
+          <w:numId w:val="1"/>
+        </w:numPr>
+        <w:spacing w:after="60"/>
+      </w:pPr>
+      <w:r>
+        <w:rPr>
+          <w:sz w:val="22"/>
+          <w:szCs w:val="22"/>
+        </w:rPr>
+        <w:t xml:space="preserve">Ensures displayed exit plans are not covered by notices.</w:t>
+      </w:r>
+    </w:p>
+    <w:p>
+      <w:pPr>
+        <w:pStyle w:val="ListParagraph"/>
+        <w:numPr>
+          <w:ilvl w:val="0"/>
+          <w:numId w:val="1"/>
+        </w:numPr>
+        <w:spacing w:after="60"/>
+      </w:pPr>
+      <w:r>
+        <w:rPr>
+          <w:sz w:val="22"/>
+          <w:szCs w:val="22"/>
+        </w:rPr>
+        <w:t xml:space="preserve">Night Duty Officer (senior doctor or senior nurse on night duty, as rostered)</w:t>
+      </w:r>
+    </w:p>
+    <w:p>
+      <w:pPr>
+        <w:pStyle w:val="ListParagraph"/>
+        <w:numPr>
+          <w:ilvl w:val="0"/>
+          <w:numId w:val="1"/>
+        </w:numPr>
+        <w:spacing w:after="60"/>
+      </w:pPr>
+      <w:r>
+        <w:rPr>
+          <w:sz w:val="22"/>
+          <w:szCs w:val="22"/>
+        </w:rPr>
+        <w:t xml:space="preserve">Holds the Medical Superintendent's emergency authority between «20:00 and 08:00».</w:t>
+      </w:r>
+    </w:p>
+    <w:p>
+      <w:pPr>
+        <w:pStyle w:val="ListParagraph"/>
+        <w:numPr>
+          <w:ilvl w:val="0"/>
+          <w:numId w:val="1"/>
+        </w:numPr>
+        <w:spacing w:after="60"/>
+      </w:pPr>
+      <w:r>
+        <w:rPr>
+          <w:sz w:val="22"/>
+          <w:szCs w:val="22"/>
+        </w:rPr>
+        <w:t xml:space="preserve">Receives the alarm, declares the event, and orders evacuate or shelter.</w:t>
+      </w:r>
+    </w:p>
+    <w:p>
+      <w:pPr>
+        <w:pStyle w:val="ListParagraph"/>
+        <w:numPr>
+          <w:ilvl w:val="0"/>
+          <w:numId w:val="1"/>
+        </w:numPr>
+        <w:spacing w:after="60"/>
+      </w:pPr>
+      <w:r>
+        <w:rPr>
+          <w:sz w:val="22"/>
+          <w:szCs w:val="22"/>
+        </w:rPr>
+        <w:t xml:space="preserve">Does not silence the panel without a watcher on the floor.</w:t>
+      </w:r>
+    </w:p>
+    <w:p>
+      <w:pPr>
+        <w:pStyle w:val="ListParagraph"/>
+        <w:numPr>
+          <w:ilvl w:val="0"/>
+          <w:numId w:val="1"/>
+        </w:numPr>
+        <w:spacing w:after="60"/>
+      </w:pPr>
+      <w:r>
+        <w:rPr>
+          <w:sz w:val="22"/>
+          <w:szCs w:val="22"/>
+        </w:rPr>
+        <w:t xml:space="preserve">Floor Fire Warden (senior staff nurse of that floor / senior nurse on night duty for that floor)</w:t>
+      </w:r>
+    </w:p>
+    <w:p>
+      <w:pPr>
+        <w:pStyle w:val="ListParagraph"/>
+        <w:numPr>
+          <w:ilvl w:val="0"/>
+          <w:numId w:val="1"/>
+        </w:numPr>
+        <w:spacing w:after="60"/>
+      </w:pPr>
+      <w:r>
+        <w:rPr>
+          <w:sz w:val="22"/>
+          <w:szCs w:val="22"/>
+        </w:rPr>
+        <w:t xml:space="preserve">Sweeps the floor, closes fire doors on the way out, reports floor clear or patients remaining.</w:t>
+      </w:r>
+    </w:p>
+    <w:p>
+      <w:pPr>
+        <w:pStyle w:val="ListParagraph"/>
+        <w:numPr>
+          <w:ilvl w:val="0"/>
+          <w:numId w:val="1"/>
+        </w:numPr>
+        <w:spacing w:after="60"/>
+      </w:pPr>
+      <w:r>
+        <w:rPr>
+          <w:sz w:val="22"/>
+          <w:szCs w:val="22"/>
+        </w:rPr>
+        <w:t xml:space="preserve">Security Supervisor (or the person covering the Security desk)</w:t>
+      </w:r>
+    </w:p>
+    <w:p>
+      <w:pPr>
+        <w:pStyle w:val="ListParagraph"/>
+        <w:numPr>
+          <w:ilvl w:val="0"/>
+          <w:numId w:val="1"/>
+        </w:numPr>
+        <w:spacing w:after="60"/>
+      </w:pPr>
+      <w:r>
+        <w:rPr>
+          <w:sz w:val="22"/>
+          <w:szCs w:val="22"/>
+        </w:rPr>
+        <w:t xml:space="preserve">Hears the panel, calls the fire service on a confirmed or un-ruled-out fire: «101 / local fire-station number held at the desk».</w:t>
+      </w:r>
+    </w:p>
+    <w:p>
+      <w:pPr>
+        <w:pStyle w:val="ListParagraph"/>
+        <w:numPr>
+          <w:ilvl w:val="0"/>
+          <w:numId w:val="1"/>
+        </w:numPr>
+        <w:spacing w:after="60"/>
+      </w:pPr>
+      <w:r>
+        <w:rPr>
+          <w:sz w:val="22"/>
+          <w:szCs w:val="22"/>
+        </w:rPr>
+        <w:t xml:space="preserve">Controls the assembly-point count against the duty roster.</w:t>
+      </w:r>
+    </w:p>
+    <w:p>
+      <w:pPr>
+        <w:pStyle w:val="ListParagraph"/>
+        <w:numPr>
+          <w:ilvl w:val="0"/>
+          <w:numId w:val="1"/>
+        </w:numPr>
+        <w:spacing w:after="60"/>
+      </w:pPr>
+      <w:r>
+        <w:rPr>
+          <w:sz w:val="22"/>
+          <w:szCs w:val="22"/>
+        </w:rPr>
+        <w:t xml:space="preserve">Keeps vehicle access clear for fire appliances.</w:t>
+      </w:r>
+    </w:p>
+    <w:p>
+      <w:pPr>
+        <w:pStyle w:val="ListParagraph"/>
+        <w:numPr>
+          <w:ilvl w:val="0"/>
+          <w:numId w:val="1"/>
+        </w:numPr>
+        <w:spacing w:after="60"/>
+      </w:pPr>
+      <w:r>
+        <w:rPr>
+          <w:sz w:val="22"/>
+          <w:szCs w:val="22"/>
+        </w:rPr>
+        <w:t xml:space="preserve">Quality Coordinator</w:t>
+      </w:r>
+    </w:p>
+    <w:p>
+      <w:pPr>
+        <w:pStyle w:val="ListParagraph"/>
+        <w:numPr>
+          <w:ilvl w:val="0"/>
+          <w:numId w:val="1"/>
+        </w:numPr>
+        <w:spacing w:after="60"/>
+      </w:pPr>
+      <w:r>
+        <w:rPr>
+          <w:sz w:val="22"/>
+          <w:szCs w:val="22"/>
+        </w:rPr>
+        <w:t xml:space="preserve">Observes drills, holds the drill file, tracks failed objectives to re-drill.</w:t>
+      </w:r>
+    </w:p>
+    <w:p>
+      <w:pPr>
+        <w:pStyle w:val="ListParagraph"/>
+        <w:numPr>
+          <w:ilvl w:val="0"/>
+          <w:numId w:val="1"/>
+        </w:numPr>
+        <w:spacing w:after="60"/>
+      </w:pPr>
+      <w:r>
+        <w:rPr>
+          <w:sz w:val="22"/>
+          <w:szCs w:val="22"/>
+        </w:rPr>
+        <w:t xml:space="preserve">Audits this policy «quarterly» (see monitoring).</w:t>
+      </w:r>
+    </w:p>
+    <w:p>
+      <w:pPr>
+        <w:pStyle w:val="ListParagraph"/>
+        <w:numPr>
+          <w:ilvl w:val="0"/>
+          <w:numId w:val="1"/>
+        </w:numPr>
+        <w:spacing w:after="60"/>
+      </w:pPr>
+      <w:r>
+        <w:rPr>
+          <w:sz w:val="22"/>
+          <w:szCs w:val="22"/>
+        </w:rPr>
+        <w:t xml:space="preserve">Dual-enters a fire, a failed drill that caused harm, or a stop-work that became an incident, in the incident system.</w:t>
+      </w:r>
+    </w:p>
+    <w:p>
+      <w:pPr>
+        <w:pStyle w:val="ListParagraph"/>
+        <w:numPr>
+          <w:ilvl w:val="0"/>
+          <w:numId w:val="1"/>
+        </w:numPr>
+        <w:spacing w:after="60"/>
+      </w:pPr>
+      <w:r>
+        <w:rPr>
+          <w:sz w:val="22"/>
+          <w:szCs w:val="22"/>
+        </w:rPr>
+        <w:t xml:space="preserve">Department in-charges (theatre, labour, laboratory, imaging, pharmacy, kitchen)</w:t>
+      </w:r>
+    </w:p>
+    <w:p>
+      <w:pPr>
+        <w:pStyle w:val="ListParagraph"/>
+        <w:numPr>
+          <w:ilvl w:val="0"/>
+          <w:numId w:val="1"/>
+        </w:numPr>
+        <w:spacing w:after="60"/>
+      </w:pPr>
+      <w:r>
+        <w:rPr>
+          <w:sz w:val="22"/>
+          <w:szCs w:val="22"/>
+        </w:rPr>
+        <w:t xml:space="preserve">Evacuate or shelter their unit on order; do not continue elective work through a fire alarm.</w:t>
+      </w:r>
+    </w:p>
+    <w:p>
+      <w:pPr>
+        <w:pStyle w:val="ListParagraph"/>
+        <w:numPr>
+          <w:ilvl w:val="0"/>
+          <w:numId w:val="1"/>
+        </w:numPr>
+        <w:spacing w:after="60"/>
+      </w:pPr>
+      <w:r>
+        <w:rPr>
+          <w:sz w:val="22"/>
+          <w:szCs w:val="22"/>
+        </w:rPr>
+        <w:t xml:space="preserve">Laboratory fire follows this plan.</w:t>
+      </w:r>
+    </w:p>
+    <w:p>
+      <w:pPr>
+        <w:pStyle w:val="ListParagraph"/>
+        <w:numPr>
+          <w:ilvl w:val="0"/>
+          <w:numId w:val="1"/>
+        </w:numPr>
+        <w:spacing w:after="60"/>
+      </w:pPr>
+      <w:r>
+        <w:rPr>
+          <w:sz w:val="22"/>
+          <w:szCs w:val="22"/>
+        </w:rPr>
+        <w:t xml:space="preserve">All staff, vendors and visiting consultants</w:t>
+      </w:r>
+    </w:p>
+    <w:p>
+      <w:pPr>
+        <w:pStyle w:val="ListParagraph"/>
+        <w:numPr>
+          <w:ilvl w:val="0"/>
+          <w:numId w:val="1"/>
+        </w:numPr>
+        <w:spacing w:after="60"/>
+      </w:pPr>
+      <w:r>
+        <w:rPr>
+          <w:sz w:val="22"/>
+          <w:szCs w:val="22"/>
+        </w:rPr>
+        <w:t xml:space="preserve">Know the route from their workplace to the assembly point.</w:t>
+      </w:r>
+    </w:p>
+    <w:p>
+      <w:pPr>
+        <w:pStyle w:val="ListParagraph"/>
+        <w:numPr>
+          <w:ilvl w:val="0"/>
+          <w:numId w:val="1"/>
+        </w:numPr>
+        <w:spacing w:after="60"/>
+      </w:pPr>
+      <w:r>
+        <w:rPr>
+          <w:sz w:val="22"/>
+          <w:szCs w:val="22"/>
+        </w:rPr>
+        <w:t xml:space="preserve">Obey stop-work and the non-negotiable rules.</w:t>
+      </w:r>
+    </w:p>
+    <w:p>
+      <w:pPr>
+        <w:pStyle w:val="ListParagraph"/>
+        <w:numPr>
+          <w:ilvl w:val="0"/>
+          <w:numId w:val="1"/>
+        </w:numPr>
+        <w:spacing w:after="60"/>
+      </w:pPr>
+      <w:r>
+        <w:rPr>
+          <w:sz w:val="22"/>
+          <w:szCs w:val="22"/>
+        </w:rPr>
+        <w:t xml:space="preserve">Do not operate fire equipment they have not been trained to operate.</w:t>
+      </w:r>
+    </w:p>
+    <w:p>
+      <w:pPr>
+        <w:spacing w:after="140"/>
+      </w:pPr>
+      <w:r>
+        <w:rPr>
+          <w:sz w:val="22"/>
+          <w:szCs w:val="22"/>
+        </w:rPr>
+        <w:t xml:space="preserve">A RACI snapshot:</w:t>
+      </w:r>
+    </w:p>
+    <w:p>
+      <w:pPr>
+        <w:pStyle w:val="ListParagraph"/>
+        <w:numPr>
+          <w:ilvl w:val="0"/>
+          <w:numId w:val="1"/>
+        </w:numPr>
+        <w:spacing w:after="60"/>
+      </w:pPr>
+      <w:r>
+        <w:rPr>
+          <w:sz w:val="22"/>
+          <w:szCs w:val="22"/>
+        </w:rPr>
+        <w:t xml:space="preserve">Alarm raised: all staff (R); Night Duty Officer / Medical Superintendent (A)</w:t>
+      </w:r>
+    </w:p>
+    <w:p>
+      <w:pPr>
+        <w:pStyle w:val="ListParagraph"/>
+        <w:numPr>
+          <w:ilvl w:val="0"/>
+          <w:numId w:val="1"/>
+        </w:numPr>
+        <w:spacing w:after="60"/>
+      </w:pPr>
+      <w:r>
+        <w:rPr>
+          <w:sz w:val="22"/>
+          <w:szCs w:val="22"/>
+        </w:rPr>
+        <w:t xml:space="preserve">First attack: trained staff on that floor (R); Maintenance In-Charge (A for equipment)</w:t>
+      </w:r>
+    </w:p>
+    <w:p>
+      <w:pPr>
+        <w:pStyle w:val="ListParagraph"/>
+        <w:numPr>
+          <w:ilvl w:val="0"/>
+          <w:numId w:val="1"/>
+        </w:numPr>
+        <w:spacing w:after="60"/>
+      </w:pPr>
+      <w:r>
+        <w:rPr>
+          <w:sz w:val="22"/>
+          <w:szCs w:val="22"/>
+        </w:rPr>
+        <w:t xml:space="preserve">Evacuation sweep: Floor Fire Warden (R); Nursing Superintendent (A)</w:t>
+      </w:r>
+    </w:p>
+    <w:p>
+      <w:pPr>
+        <w:pStyle w:val="ListParagraph"/>
+        <w:numPr>
+          <w:ilvl w:val="0"/>
+          <w:numId w:val="1"/>
+        </w:numPr>
+        <w:spacing w:after="60"/>
+      </w:pPr>
+      <w:r>
+        <w:rPr>
+          <w:sz w:val="22"/>
+          <w:szCs w:val="22"/>
+        </w:rPr>
+        <w:t xml:space="preserve">Fire service called: Security Supervisor (R); Night Duty Officer (A)</w:t>
+      </w:r>
+    </w:p>
+    <w:p>
+      <w:pPr>
+        <w:pStyle w:val="ListParagraph"/>
+        <w:numPr>
+          <w:ilvl w:val="0"/>
+          <w:numId w:val="1"/>
+        </w:numPr>
+        <w:spacing w:after="60"/>
+      </w:pPr>
+      <w:r>
+        <w:rPr>
+          <w:sz w:val="22"/>
+          <w:szCs w:val="22"/>
+        </w:rPr>
+        <w:t xml:space="preserve">Isolation of power / gas: Maintenance In-Charge or trained night technician (R); Medical Superintendent / Night Duty Officer (A)</w:t>
+      </w:r>
+    </w:p>
+    <w:p>
+      <w:pPr>
+        <w:pStyle w:val="ListParagraph"/>
+        <w:numPr>
+          <w:ilvl w:val="0"/>
+          <w:numId w:val="1"/>
+        </w:numPr>
+        <w:spacing w:after="60"/>
+      </w:pPr>
+      <w:r>
+        <w:rPr>
+          <w:sz w:val="22"/>
+          <w:szCs w:val="22"/>
+        </w:rPr>
+        <w:t xml:space="preserve">Maintenance &amp; NOC: Maintenance In-Charge (R/A)</w:t>
+      </w:r>
+    </w:p>
+    <w:p>
+      <w:pPr>
+        <w:pStyle w:val="ListParagraph"/>
+        <w:numPr>
+          <w:ilvl w:val="0"/>
+          <w:numId w:val="1"/>
+        </w:numPr>
+        <w:spacing w:after="60"/>
+      </w:pPr>
+      <w:r>
+        <w:rPr>
+          <w:sz w:val="22"/>
+          <w:szCs w:val="22"/>
+        </w:rPr>
+        <w:t xml:space="preserve">Drills: Quality Coordinator (R for observation); Medical Superintendent (A)</w:t>
+      </w:r>
+    </w:p>
+    <w:p>
+      <w:pPr>
+        <w:pStyle w:val="ListParagraph"/>
+        <w:numPr>
+          <w:ilvl w:val="0"/>
+          <w:numId w:val="1"/>
+        </w:numPr>
+        <w:spacing w:after="60"/>
+      </w:pPr>
+      <w:r>
+        <w:rPr>
+          <w:sz w:val="22"/>
+          <w:szCs w:val="22"/>
+        </w:rPr>
+        <w:t xml:space="preserve">Continuity / divert: Medical Superintendent or Night Duty Officer (R/A)</w:t>
+      </w:r>
+    </w:p>
+    <w:p>
+      <w:pPr>
+        <w:pStyle w:val="ListParagraph"/>
+        <w:numPr>
+          <w:ilvl w:val="0"/>
+          <w:numId w:val="1"/>
+        </w:numPr>
+        <w:spacing w:after="60"/>
+      </w:pPr>
+      <w:r>
+        <w:rPr>
+          <w:sz w:val="22"/>
+          <w:szCs w:val="22"/>
+        </w:rPr>
+        <w:t xml:space="preserve">Stop-work: all staff (R); Maintenance In-Charge (A for restart)</w:t>
       </w:r>
     </w:p>
     <w:p>
@@ -3206,7 +3001,212 @@
         <w:spacing w:after="120" w:before="280"/>
       </w:pPr>
       <w:r>
-        <w:t xml:space="preserve">8. Training and staff acknowledgement</w:t>
+        <w:t xml:space="preserve">8. Quality monitoring (RCA → CAPA)</w:t>
+      </w:r>
+    </w:p>
+    <w:p>
+      <w:pPr>
+        <w:spacing w:after="140"/>
+      </w:pPr>
+      <w:r>
+        <w:rPr>
+          <w:sz w:val="22"/>
+          <w:szCs w:val="22"/>
+        </w:rPr>
+        <w:t xml:space="preserve">The Quality Coordinator audits this policy «quarterly», and after every real activation or failed drill. The audit looks at the provisions and the records, not at a binder.</w:t>
+      </w:r>
+    </w:p>
+    <w:p>
+      <w:pPr>
+        <w:spacing w:after="140"/>
+      </w:pPr>
+      <w:r>
+        <w:rPr>
+          <w:sz w:val="22"/>
+          <w:szCs w:val="22"/>
+        </w:rPr>
+        <w:t xml:space="preserve">What is monitored each quarter:</w:t>
+      </w:r>
+    </w:p>
+    <w:p>
+      <w:pPr>
+        <w:pStyle w:val="ListParagraph"/>
+        <w:numPr>
+          <w:ilvl w:val="0"/>
+          <w:numId w:val="1"/>
+        </w:numPr>
+        <w:spacing w:after="60"/>
+      </w:pPr>
+      <w:r>
+        <w:rPr>
+          <w:sz w:val="22"/>
+          <w:szCs w:val="22"/>
+        </w:rPr>
+        <w:t xml:space="preserve">Extinguishers: monthly visual sheets for the quarter; any gauge in the red closed the same shift.</w:t>
+      </w:r>
+    </w:p>
+    <w:p>
+      <w:pPr>
+        <w:pStyle w:val="ListParagraph"/>
+        <w:numPr>
+          <w:ilvl w:val="0"/>
+          <w:numId w:val="1"/>
+        </w:numPr>
+        <w:spacing w:after="60"/>
+      </w:pPr>
+      <w:r>
+        <w:rPr>
+          <w:sz w:val="22"/>
+          <w:szCs w:val="22"/>
+        </w:rPr>
+        <w:t xml:space="preserve">Detectors and panel: last quarterly functional test; any isolated zone has a current permit and a watcher.</w:t>
+      </w:r>
+    </w:p>
+    <w:p>
+      <w:pPr>
+        <w:pStyle w:val="ListParagraph"/>
+        <w:numPr>
+          <w:ilvl w:val="0"/>
+          <w:numId w:val="1"/>
+        </w:numPr>
+        <w:spacing w:after="60"/>
+      </w:pPr>
+      <w:r>
+        <w:rPr>
+          <w:sz w:val="22"/>
+          <w:szCs w:val="22"/>
+        </w:rPr>
+        <w:t xml:space="preserve">Fire doors: monthly round findings closed; no door on a watcher older than «24 hours» without Medical Superintendent sign-off.</w:t>
+      </w:r>
+    </w:p>
+    <w:p>
+      <w:pPr>
+        <w:pStyle w:val="ListParagraph"/>
+        <w:numPr>
+          <w:ilvl w:val="0"/>
+          <w:numId w:val="1"/>
+        </w:numPr>
+        <w:spacing w:after="60"/>
+      </w:pPr>
+      <w:r>
+        <w:rPr>
+          <w:sz w:val="22"/>
+          <w:szCs w:val="22"/>
+        </w:rPr>
+        <w:t xml:space="preserve">Exit displays: still match the drawings; assembly point still as issued.</w:t>
+      </w:r>
+    </w:p>
+    <w:p>
+      <w:pPr>
+        <w:pStyle w:val="ListParagraph"/>
+        <w:numPr>
+          <w:ilvl w:val="0"/>
+          <w:numId w:val="1"/>
+        </w:numPr>
+        <w:spacing w:after="60"/>
+      </w:pPr>
+      <w:r>
+        <w:rPr>
+          <w:sz w:val="22"/>
+          <w:szCs w:val="22"/>
+        </w:rPr>
+        <w:t xml:space="preserve">Drill calendar: two drills dated in the last twelve months, one fire and one named non-fire, one of them night or weekend; dependent-patient move recorded; failed objectives re-drilled inside thirty days.</w:t>
+      </w:r>
+    </w:p>
+    <w:p>
+      <w:pPr>
+        <w:pStyle w:val="ListParagraph"/>
+        <w:numPr>
+          <w:ilvl w:val="0"/>
+          <w:numId w:val="1"/>
+        </w:numPr>
+        <w:spacing w:after="60"/>
+      </w:pPr>
+      <w:r>
+        <w:rPr>
+          <w:sz w:val="22"/>
+          <w:szCs w:val="22"/>
+        </w:rPr>
+        <w:t xml:space="preserve">Continuity card: receiving hospital named; oxygen-dependent in-patients listed.</w:t>
+      </w:r>
+    </w:p>
+    <w:p>
+      <w:pPr>
+        <w:pStyle w:val="ListParagraph"/>
+        <w:numPr>
+          <w:ilvl w:val="0"/>
+          <w:numId w:val="1"/>
+        </w:numPr>
+        <w:spacing w:after="60"/>
+      </w:pPr>
+      <w:r>
+        <w:rPr>
+          <w:sz w:val="22"/>
+          <w:szCs w:val="22"/>
+        </w:rPr>
+        <w:t xml:space="preserve">Stop-work and incident dual-entry: every activation and every stop-work that met the incident definition is in the incident file.</w:t>
+      </w:r>
+    </w:p>
+    <w:p>
+      <w:pPr>
+        <w:pStyle w:val="ListParagraph"/>
+        <w:numPr>
+          <w:ilvl w:val="0"/>
+          <w:numId w:val="1"/>
+        </w:numPr>
+        <w:spacing w:after="60"/>
+      </w:pPr>
+      <w:r>
+        <w:rPr>
+          <w:sz w:val="22"/>
+          <w:szCs w:val="22"/>
+        </w:rPr>
+        <w:t xml:space="preserve">Fire NOC: still current.</w:t>
+      </w:r>
+    </w:p>
+    <w:p>
+      <w:pPr>
+        <w:spacing w:after="140"/>
+      </w:pPr>
+      <w:r>
+        <w:rPr>
+          <w:sz w:val="22"/>
+          <w:szCs w:val="22"/>
+        </w:rPr>
+        <w:t xml:space="preserve">Any non-conformity is a finding. The Maintenance In-Charge (equipment and fabric) or the Nursing Superintendent (wardens, displays, dependent-patient move) owns the corrective action. Root-cause analysis is required when: a drill objective fails twice; a real alarm is not heard at the Nursing Station; a fire door is found wedged on two successive rounds; an extinguisher is found discharged or missing; or a person operated a pump, panel or gas isolation without being on the trained list.</w:t>
+      </w:r>
+    </w:p>
+    <w:p>
+      <w:pPr>
+        <w:spacing w:after="140"/>
+      </w:pPr>
+      <w:r>
+        <w:rPr>
+          <w:sz w:val="22"/>
+          <w:szCs w:val="22"/>
+        </w:rPr>
+        <w:t xml:space="preserve">Corrective and preventive action is dated, has an owner, and is checked at the next quarterly audit. An open CAPA older than «thirty days» is escalated to the Medical Superintendent.</w:t>
+      </w:r>
+    </w:p>
+    <w:p>
+      <w:pPr>
+        <w:spacing w:after="140"/>
+      </w:pPr>
+      <w:r>
+        <w:rPr>
+          <w:sz w:val="22"/>
+          <w:szCs w:val="22"/>
+        </w:rPr>
+        <w:t xml:space="preserve">This policy is reviewed «annually», and sooner after a real fire, a failed drill, a change to the fire NOC, a change of assembly point, or a change to the receiving hospital.</w:t>
+      </w:r>
+    </w:p>
+    <w:p>
+      <w:pPr>
+        <w:pStyle w:val="Heading1"/>
+        <w:spacing w:after="120" w:before="280"/>
+      </w:pPr>
+      <w:r>
+        <w:t xml:space="preserve">9. Training and staff acknowledgement</w:t>
       </w:r>
     </w:p>
     <w:p>
@@ -4022,7 +4022,7 @@
         <w:spacing w:after="120" w:before="280"/>
       </w:pPr>
       <w:r>
-        <w:t xml:space="preserve">9. References</w:t>
+        <w:t xml:space="preserve">10. References</w:t>
       </w:r>
     </w:p>
     <w:p>
@@ -4116,7 +4116,7 @@
         <w:spacing w:after="120" w:before="280"/>
       </w:pPr>
       <w:r>
-        <w:t xml:space="preserve">10. Distribution</w:t>
+        <w:t xml:space="preserve">11. Distribution</w:t>
       </w:r>
     </w:p>
     <w:p>
@@ -4173,7 +4173,7 @@
         <w:spacing w:after="120" w:before="280"/>
       </w:pPr>
       <w:r>
-        <w:t xml:space="preserve">11. Abbreviations</w:t>
+        <w:t xml:space="preserve">12. Abbreviations</w:t>
       </w:r>
     </w:p>
     <w:p>
@@ -4214,7 +4214,7 @@
         <w:spacing w:after="120" w:before="280"/>
       </w:pPr>
       <w:r>
-        <w:t xml:space="preserve">12. Traceability to NABH SHCO 3rd Edition FMS.5</w:t>
+        <w:t xml:space="preserve">13. Traceability to NABH SHCO 3rd Edition FMS.5</w:t>
       </w:r>
     </w:p>
     <w:p>
@@ -4406,7 +4406,7 @@
                 <w:sz w:val="18"/>
                 <w:szCs w:val="18"/>
               </w:rPr>
-              <w:t xml:space="preserve">Safety objective; Policy standards; Detection and alarm; First attack and containment; Named non-fire emergencies; Non-negotiable rules</w:t>
+              <w:t xml:space="preserve">Safety objective; Section 3; 5.1 Detection and alarm; 5.2 First attack and containment; 5.4 Named non-fire emergencies; Section 4</w:t>
             </w:r>
           </w:p>
         </w:tc>
@@ -4496,7 +4496,7 @@
                 <w:sz w:val="18"/>
                 <w:szCs w:val="18"/>
               </w:rPr>
-              <w:t xml:space="preserve">Policy standards; Evacuation, assembly and dependent patients; Exit plan — documented and displayed</w:t>
+              <w:t xml:space="preserve">Section 3; 5.3 Evacuation, assembly and dependent patients; 5.5 Exit plan — documented and displayed</w:t>
             </w:r>
           </w:p>
         </w:tc>
@@ -4586,7 +4586,7 @@
                 <w:sz w:val="18"/>
                 <w:szCs w:val="18"/>
               </w:rPr>
-              <w:t xml:space="preserve">Policy standards; Mock drills; Quality monitoring; Non-negotiable rules (item 10)</w:t>
+              <w:t xml:space="preserve">Section 3; 5.7 Mock drills; Section 8 Quality monitoring; Section 4 item 10</w:t>
             </w:r>
           </w:p>
         </w:tc>
@@ -4676,7 +4676,7 @@
                 <w:sz w:val="18"/>
                 <w:szCs w:val="18"/>
               </w:rPr>
-              <w:t xml:space="preserve">First attack and containment; Maintenance of fire equipment and infrastructure; Quality monitoring; Non-negotiable rules (items 3, 4, 7)</w:t>
+              <w:t xml:space="preserve">5.2 First attack; 5.6 Maintenance of fire equipment and infrastructure; Section 8 Quality monitoring; Section 4 items 3, 4, 7</w:t>
             </w:r>
           </w:p>
         </w:tc>
@@ -4766,7 +4766,7 @@
                 <w:sz w:val="18"/>
                 <w:szCs w:val="18"/>
               </w:rPr>
-              <w:t xml:space="preserve">Policy standards; Service continuity; Governance matrix</w:t>
+              <w:t xml:space="preserve">Section 3; 5.8 Service continuity; Section 7 Governance</w:t>
             </w:r>
           </w:p>
         </w:tc>

</xml_diff>

<commit_message>
feat: add FMS.5 v2 records checklist as section 14 annex
Per-OE list of records this policy actually generates, placed after
the traceability table. No assessor framing. Regenerates the Word preview.

Co-authored-by: upadhyaymehul9-prog <upadhyaymehul9-prog@users.noreply.github.com>
</commit_message>
<xml_diff>
--- a/policies/build/preview/FMS.5_v2_preview.docx
+++ b/policies/build/preview/FMS.5_v2_preview.docx
@@ -175,7 +175,7 @@
                 <w:sz w:val="18"/>
                 <w:szCs w:val="18"/>
               </w:rPr>
-              <w:t xml:space="preserve">2.1</w:t>
+              <w:t xml:space="preserve">2.2</w:t>
             </w:r>
           </w:p>
         </w:tc>
@@ -4794,6 +4794,584 @@
         </w:tc>
       </w:tr>
     </w:tbl>
+    <w:p>
+      <w:pPr>
+        <w:pStyle w:val="Heading1"/>
+        <w:spacing w:after="120" w:before="280"/>
+      </w:pPr>
+      <w:r>
+        <w:t xml:space="preserve">14. Required Records / Evidence Checklist</w:t>
+      </w:r>
+    </w:p>
+    <w:p>
+      <w:pPr>
+        <w:spacing w:after="120"/>
+      </w:pPr>
+      <w:r>
+        <w:rPr>
+          <w:i/>
+          <w:iCs/>
+          <w:sz w:val="20"/>
+          <w:szCs w:val="20"/>
+        </w:rPr>
+        <w:t xml:space="preserve">Records the hospital holds under this policy, listed by objective element.</w:t>
+      </w:r>
+    </w:p>
+    <w:p>
+      <w:pPr>
+        <w:pStyle w:val="Heading2"/>
+        <w:spacing w:after="100" w:before="220"/>
+      </w:pPr>
+      <w:r>
+        <w:t xml:space="preserve">FMS.5.a — The organisation has plans and provisions for early detection, abatement and containment of the fire, and non-fire emergencies.</w:t>
+      </w:r>
+    </w:p>
+    <w:p>
+      <w:pPr>
+        <w:pStyle w:val="ListParagraph"/>
+        <w:numPr>
+          <w:ilvl w:val="0"/>
+          <w:numId w:val="1"/>
+        </w:numPr>
+        <w:spacing w:after="60"/>
+      </w:pPr>
+      <w:r>
+        <w:rPr>
+          <w:sz w:val="22"/>
+          <w:szCs w:val="22"/>
+        </w:rPr>
+        <w:t xml:space="preserve">Current fire NOC, held by the Maintenance In-Charge with the as-built fire drawings.</w:t>
+      </w:r>
+    </w:p>
+    <w:p>
+      <w:pPr>
+        <w:pStyle w:val="ListParagraph"/>
+        <w:numPr>
+          <w:ilvl w:val="0"/>
+          <w:numId w:val="1"/>
+        </w:numPr>
+        <w:spacing w:after="60"/>
+      </w:pPr>
+      <w:r>
+        <w:rPr>
+          <w:sz w:val="22"/>
+          <w:szCs w:val="22"/>
+        </w:rPr>
+        <w:t xml:space="preserve">Quarterly functional-test records for the fire alarm panel, detectors, sounders and manual call points.</w:t>
+      </w:r>
+    </w:p>
+    <w:p>
+      <w:pPr>
+        <w:pStyle w:val="ListParagraph"/>
+        <w:numPr>
+          <w:ilvl w:val="0"/>
+          <w:numId w:val="1"/>
+        </w:numPr>
+        <w:spacing w:after="60"/>
+      </w:pPr>
+      <w:r>
+        <w:rPr>
+          <w:sz w:val="22"/>
+          <w:szCs w:val="22"/>
+        </w:rPr>
+        <w:t xml:space="preserve">Written isolation permits for any isolated detector or zone, with a named watcher and same-shift restoration.</w:t>
+      </w:r>
+    </w:p>
+    <w:p>
+      <w:pPr>
+        <w:pStyle w:val="ListParagraph"/>
+        <w:numPr>
+          <w:ilvl w:val="0"/>
+          <w:numId w:val="1"/>
+        </w:numPr>
+        <w:spacing w:after="60"/>
+      </w:pPr>
+      <w:r>
+        <w:rPr>
+          <w:sz w:val="22"/>
+          <w:szCs w:val="22"/>
+        </w:rPr>
+        <w:t xml:space="preserve">Trained-operator list for the fire panel, pumps if installed, and medical-gas / electrical zone isolation.</w:t>
+      </w:r>
+    </w:p>
+    <w:p>
+      <w:pPr>
+        <w:pStyle w:val="ListParagraph"/>
+        <w:numPr>
+          <w:ilvl w:val="0"/>
+          <w:numId w:val="1"/>
+        </w:numPr>
+        <w:spacing w:after="60"/>
+      </w:pPr>
+      <w:r>
+        <w:rPr>
+          <w:sz w:val="22"/>
+          <w:szCs w:val="22"/>
+        </w:rPr>
+        <w:t xml:space="preserve">Named non-fire event list, including any Medical Superintendent record that flood or lift entrapment is not applicable.</w:t>
+      </w:r>
+    </w:p>
+    <w:p>
+      <w:pPr>
+        <w:pStyle w:val="ListParagraph"/>
+        <w:numPr>
+          <w:ilvl w:val="0"/>
+          <w:numId w:val="1"/>
+        </w:numPr>
+        <w:spacing w:after="60"/>
+      </w:pPr>
+      <w:r>
+        <w:rPr>
+          <w:sz w:val="22"/>
+          <w:szCs w:val="22"/>
+        </w:rPr>
+        <w:t xml:space="preserve">Floor Fire Warden roster for each occupied floor, day and night.</w:t>
+      </w:r>
+    </w:p>
+    <w:p>
+      <w:pPr>
+        <w:pStyle w:val="ListParagraph"/>
+        <w:numPr>
+          <w:ilvl w:val="0"/>
+          <w:numId w:val="1"/>
+        </w:numPr>
+        <w:spacing w:after="60"/>
+      </w:pPr>
+      <w:r>
+        <w:rPr>
+          <w:sz w:val="22"/>
+          <w:szCs w:val="22"/>
+        </w:rPr>
+        <w:t xml:space="preserve">Incident-file entries for every real activation and every stop-work that met the incident definition.</w:t>
+      </w:r>
+    </w:p>
+    <w:p>
+      <w:pPr>
+        <w:pStyle w:val="Heading2"/>
+        <w:spacing w:after="100" w:before="220"/>
+      </w:pPr>
+      <w:r>
+        <w:t xml:space="preserve">FMS.5.b — The organisation has a documented and displayed exit plan in case of fire and non-fire emergencies</w:t>
+      </w:r>
+    </w:p>
+    <w:p>
+      <w:pPr>
+        <w:pStyle w:val="ListParagraph"/>
+        <w:numPr>
+          <w:ilvl w:val="0"/>
+          <w:numId w:val="1"/>
+        </w:numPr>
+        <w:spacing w:after="60"/>
+      </w:pPr>
+      <w:r>
+        <w:rPr>
+          <w:sz w:val="22"/>
+          <w:szCs w:val="22"/>
+        </w:rPr>
+        <w:t xml:space="preserve">As-built fire drawings.</w:t>
+      </w:r>
+    </w:p>
+    <w:p>
+      <w:pPr>
+        <w:pStyle w:val="ListParagraph"/>
+        <w:numPr>
+          <w:ilvl w:val="0"/>
+          <w:numId w:val="1"/>
+        </w:numPr>
+        <w:spacing w:after="60"/>
+      </w:pPr>
+      <w:r>
+        <w:rPr>
+          <w:sz w:val="22"/>
+          <w:szCs w:val="22"/>
+        </w:rPr>
+        <w:t xml:space="preserve">Displayed exit plan on each occupied floor, dated, matching the drawings, naming the assembly point.</w:t>
+      </w:r>
+    </w:p>
+    <w:p>
+      <w:pPr>
+        <w:pStyle w:val="ListParagraph"/>
+        <w:numPr>
+          <w:ilvl w:val="0"/>
+          <w:numId w:val="1"/>
+        </w:numPr>
+        <w:spacing w:after="60"/>
+      </w:pPr>
+      <w:r>
+        <w:rPr>
+          <w:sz w:val="22"/>
+          <w:szCs w:val="22"/>
+        </w:rPr>
+        <w:t xml:space="preserve">Record that the display was updated the same day a fire door, ward or stair was taken out of use.</w:t>
+      </w:r>
+    </w:p>
+    <w:p>
+      <w:pPr>
+        <w:pStyle w:val="ListParagraph"/>
+        <w:numPr>
+          <w:ilvl w:val="0"/>
+          <w:numId w:val="1"/>
+        </w:numPr>
+        <w:spacing w:after="60"/>
+      </w:pPr>
+      <w:r>
+        <w:rPr>
+          <w:sz w:val="22"/>
+          <w:szCs w:val="22"/>
+        </w:rPr>
+        <w:t xml:space="preserve">Induction record that each staff member walked the route to the assembly point before a first night shift.</w:t>
+      </w:r>
+    </w:p>
+    <w:p>
+      <w:pPr>
+        <w:pStyle w:val="Heading2"/>
+        <w:spacing w:after="100" w:before="220"/>
+      </w:pPr>
+      <w:r>
+        <w:t xml:space="preserve">FMS.5.c — Mock drills are held at least twice a year.</w:t>
+      </w:r>
+    </w:p>
+    <w:p>
+      <w:pPr>
+        <w:pStyle w:val="ListParagraph"/>
+        <w:numPr>
+          <w:ilvl w:val="0"/>
+          <w:numId w:val="1"/>
+        </w:numPr>
+        <w:spacing w:after="60"/>
+      </w:pPr>
+      <w:r>
+        <w:rPr>
+          <w:sz w:val="22"/>
+          <w:szCs w:val="22"/>
+        </w:rPr>
+        <w:t xml:space="preserve">Drill file: two dated drills in the last twelve months — one fire, one named non-fire.</w:t>
+      </w:r>
+    </w:p>
+    <w:p>
+      <w:pPr>
+        <w:pStyle w:val="ListParagraph"/>
+        <w:numPr>
+          <w:ilvl w:val="0"/>
+          <w:numId w:val="1"/>
+        </w:numPr>
+        <w:spacing w:after="60"/>
+      </w:pPr>
+      <w:r>
+        <w:rPr>
+          <w:sz w:val="22"/>
+          <w:szCs w:val="22"/>
+        </w:rPr>
+        <w:t xml:space="preserve">Observed objective list for each drill.</w:t>
+      </w:r>
+    </w:p>
+    <w:p>
+      <w:pPr>
+        <w:pStyle w:val="ListParagraph"/>
+        <w:numPr>
+          <w:ilvl w:val="0"/>
+          <w:numId w:val="1"/>
+        </w:numPr>
+        <w:spacing w:after="60"/>
+      </w:pPr>
+      <w:r>
+        <w:rPr>
+          <w:sz w:val="22"/>
+          <w:szCs w:val="22"/>
+        </w:rPr>
+        <w:t xml:space="preserve">Dependent-patient move recorded in every drill.</w:t>
+      </w:r>
+    </w:p>
+    <w:p>
+      <w:pPr>
+        <w:pStyle w:val="ListParagraph"/>
+        <w:numPr>
+          <w:ilvl w:val="0"/>
+          <w:numId w:val="1"/>
+        </w:numPr>
+        <w:spacing w:after="60"/>
+      </w:pPr>
+      <w:r>
+        <w:rPr>
+          <w:sz w:val="22"/>
+          <w:szCs w:val="22"/>
+        </w:rPr>
+        <w:t xml:space="preserve">Record that at least one of the two drills in any twelve-month period was a night or weekend shift.</w:t>
+      </w:r>
+    </w:p>
+    <w:p>
+      <w:pPr>
+        <w:pStyle w:val="ListParagraph"/>
+        <w:numPr>
+          <w:ilvl w:val="0"/>
+          <w:numId w:val="1"/>
+        </w:numPr>
+        <w:spacing w:after="60"/>
+      </w:pPr>
+      <w:r>
+        <w:rPr>
+          <w:sz w:val="22"/>
+          <w:szCs w:val="22"/>
+        </w:rPr>
+        <w:t xml:space="preserve">Re-drill of any failed objective within thirty days.</w:t>
+      </w:r>
+    </w:p>
+    <w:p>
+      <w:pPr>
+        <w:pStyle w:val="ListParagraph"/>
+        <w:numPr>
+          <w:ilvl w:val="0"/>
+          <w:numId w:val="1"/>
+        </w:numPr>
+        <w:spacing w:after="60"/>
+      </w:pPr>
+      <w:r>
+        <w:rPr>
+          <w:sz w:val="22"/>
+          <w:szCs w:val="22"/>
+        </w:rPr>
+        <w:t xml:space="preserve">Signed staff acknowledgements, held by the Nursing Superintendent with the induction record.</w:t>
+      </w:r>
+    </w:p>
+    <w:p>
+      <w:pPr>
+        <w:pStyle w:val="ListParagraph"/>
+        <w:numPr>
+          <w:ilvl w:val="0"/>
+          <w:numId w:val="1"/>
+        </w:numPr>
+        <w:spacing w:after="60"/>
+      </w:pPr>
+      <w:r>
+        <w:rPr>
+          <w:sz w:val="22"/>
+          <w:szCs w:val="22"/>
+        </w:rPr>
+        <w:t xml:space="preserve">CAPA for a drill objective that fails twice, or for a drill that caused harm.</w:t>
+      </w:r>
+    </w:p>
+    <w:p>
+      <w:pPr>
+        <w:pStyle w:val="Heading2"/>
+        <w:spacing w:after="100" w:before="220"/>
+      </w:pPr>
+      <w:r>
+        <w:t xml:space="preserve">FMS.5.d — There is a maintenance plan for fire-related equipment and infrastructure.</w:t>
+      </w:r>
+    </w:p>
+    <w:p>
+      <w:pPr>
+        <w:pStyle w:val="ListParagraph"/>
+        <w:numPr>
+          <w:ilvl w:val="0"/>
+          <w:numId w:val="1"/>
+        </w:numPr>
+        <w:spacing w:after="60"/>
+      </w:pPr>
+      <w:r>
+        <w:rPr>
+          <w:sz w:val="22"/>
+          <w:szCs w:val="22"/>
+        </w:rPr>
+        <w:t xml:space="preserve">Monthly extinguisher visual sheets; annual servicing job cards.</w:t>
+      </w:r>
+    </w:p>
+    <w:p>
+      <w:pPr>
+        <w:pStyle w:val="ListParagraph"/>
+        <w:numPr>
+          <w:ilvl w:val="0"/>
+          <w:numId w:val="1"/>
+        </w:numPr>
+        <w:spacing w:after="60"/>
+      </w:pPr>
+      <w:r>
+        <w:rPr>
+          <w:sz w:val="22"/>
+          <w:szCs w:val="22"/>
+        </w:rPr>
+        <w:t xml:space="preserve">Quarterly panel and detector functional-test records; annual service job cards.</w:t>
+      </w:r>
+    </w:p>
+    <w:p>
+      <w:pPr>
+        <w:pStyle w:val="ListParagraph"/>
+        <w:numPr>
+          <w:ilvl w:val="0"/>
+          <w:numId w:val="1"/>
+        </w:numPr>
+        <w:spacing w:after="60"/>
+      </w:pPr>
+      <w:r>
+        <w:rPr>
+          <w:sz w:val="22"/>
+          <w:szCs w:val="22"/>
+        </w:rPr>
+        <w:t xml:space="preserve">Isolation permits for failed detector zones, with a compensating watcher until restored.</w:t>
+      </w:r>
+    </w:p>
+    <w:p>
+      <w:pPr>
+        <w:pStyle w:val="ListParagraph"/>
+        <w:numPr>
+          <w:ilvl w:val="0"/>
+          <w:numId w:val="1"/>
+        </w:numPr>
+        <w:spacing w:after="60"/>
+      </w:pPr>
+      <w:r>
+        <w:rPr>
+          <w:sz w:val="22"/>
+          <w:szCs w:val="22"/>
+        </w:rPr>
+        <w:t xml:space="preserve">Emergency-lighting monthly functional tests and annual duration tests.</w:t>
+      </w:r>
+    </w:p>
+    <w:p>
+      <w:pPr>
+        <w:pStyle w:val="ListParagraph"/>
+        <w:numPr>
+          <w:ilvl w:val="0"/>
+          <w:numId w:val="1"/>
+        </w:numPr>
+        <w:spacing w:after="60"/>
+      </w:pPr>
+      <w:r>
+        <w:rPr>
+          <w:sz w:val="22"/>
+          <w:szCs w:val="22"/>
+        </w:rPr>
+        <w:t xml:space="preserve">Monthly facility-round findings on fire doors and closers, closed within 24 hours or on a watcher.</w:t>
+      </w:r>
+    </w:p>
+    <w:p>
+      <w:pPr>
+        <w:pStyle w:val="ListParagraph"/>
+        <w:numPr>
+          <w:ilvl w:val="0"/>
+          <w:numId w:val="1"/>
+        </w:numPr>
+        <w:spacing w:after="60"/>
+      </w:pPr>
+      <w:r>
+        <w:rPr>
+          <w:sz w:val="22"/>
+          <w:szCs w:val="22"/>
+        </w:rPr>
+        <w:t xml:space="preserve">If installed: weekly pump auto-start, quarterly water-flow or valve inspection, annual service job cards.</w:t>
+      </w:r>
+    </w:p>
+    <w:p>
+      <w:pPr>
+        <w:pStyle w:val="ListParagraph"/>
+        <w:numPr>
+          <w:ilvl w:val="0"/>
+          <w:numId w:val="1"/>
+        </w:numPr>
+        <w:spacing w:after="60"/>
+      </w:pPr>
+      <w:r>
+        <w:rPr>
+          <w:sz w:val="22"/>
+          <w:szCs w:val="22"/>
+        </w:rPr>
+        <w:t xml:space="preserve">Fire NOC (held; not used as a job card).</w:t>
+      </w:r>
+    </w:p>
+    <w:p>
+      <w:pPr>
+        <w:pStyle w:val="ListParagraph"/>
+        <w:numPr>
+          <w:ilvl w:val="0"/>
+          <w:numId w:val="1"/>
+        </w:numPr>
+        <w:spacing w:after="60"/>
+      </w:pPr>
+      <w:r>
+        <w:rPr>
+          <w:sz w:val="22"/>
+          <w:szCs w:val="22"/>
+        </w:rPr>
+        <w:t xml:space="preserve">CAPA for a failed extinguisher, isolated zone, or pump that will not start.</w:t>
+      </w:r>
+    </w:p>
+    <w:p>
+      <w:pPr>
+        <w:pStyle w:val="Heading2"/>
+        <w:spacing w:after="100" w:before="220"/>
+      </w:pPr>
+      <w:r>
+        <w:t xml:space="preserve">FMS.5.e — The organisation has a service continuity plan in case of fire and non-fire emergencies.</w:t>
+      </w:r>
+    </w:p>
+    <w:p>
+      <w:pPr>
+        <w:pStyle w:val="ListParagraph"/>
+        <w:numPr>
+          <w:ilvl w:val="0"/>
+          <w:numId w:val="1"/>
+        </w:numPr>
+        <w:spacing w:after="60"/>
+      </w:pPr>
+      <w:r>
+        <w:rPr>
+          <w:sz w:val="22"/>
+          <w:szCs w:val="22"/>
+        </w:rPr>
+        <w:t xml:space="preserve">Continuity card at the Nursing Station: receiving hospital named; oxygen-dependent in-patients listed.</w:t>
+      </w:r>
+    </w:p>
+    <w:p>
+      <w:pPr>
+        <w:pStyle w:val="ListParagraph"/>
+        <w:numPr>
+          <w:ilvl w:val="0"/>
+          <w:numId w:val="1"/>
+        </w:numPr>
+        <w:spacing w:after="60"/>
+      </w:pPr>
+      <w:r>
+        <w:rPr>
+          <w:sz w:val="22"/>
+          <w:szCs w:val="22"/>
+        </w:rPr>
+        <w:t xml:space="preserve">Named receiving hospital on the issued document.</w:t>
+      </w:r>
+    </w:p>
+    <w:p>
+      <w:pPr>
+        <w:pStyle w:val="ListParagraph"/>
+        <w:numPr>
+          <w:ilvl w:val="0"/>
+          <w:numId w:val="1"/>
+        </w:numPr>
+        <w:spacing w:after="60"/>
+      </w:pPr>
+      <w:r>
+        <w:rPr>
+          <w:sz w:val="22"/>
+          <w:szCs w:val="22"/>
+        </w:rPr>
+        <w:t xml:space="preserve">Recorded continuity decision after an activation: continue, pause, move internally, or divert.</w:t>
+      </w:r>
+    </w:p>
+    <w:p>
+      <w:pPr>
+        <w:pStyle w:val="ListParagraph"/>
+        <w:numPr>
+          <w:ilvl w:val="0"/>
+          <w:numId w:val="1"/>
+        </w:numPr>
+        <w:spacing w:after="60"/>
+      </w:pPr>
+      <w:r>
+        <w:rPr>
+          <w:sz w:val="22"/>
+          <w:szCs w:val="22"/>
+        </w:rPr>
+        <w:t xml:space="preserve">CAPA after a real fire or named non-fire activation.</w:t>
+      </w:r>
+    </w:p>
     <w:p>
       <w:pPr>
         <w:pStyle w:val="Heading1"/>

</xml_diff>